<commit_message>
update the structure in oops
</commit_message>
<xml_diff>
--- a/OOPs/notes/Unit-1.docx
+++ b/OOPs/notes/Unit-1.docx
@@ -3335,7 +3335,7 @@
           <w:szCs w:val="20"/>
         </w:rPr>
         <w:pict w14:anchorId="45167A4B">
-          <v:rect id="_x0000_i1632" style="width:0;height:1.5pt" o:hralign="center" o:hrstd="t" o:hr="t" fillcolor="#a0a0a0" stroked="f"/>
+          <v:rect id="_x0000_i1026" style="width:0;height:1.5pt" o:hralign="center" o:hrstd="t" o:hr="t" fillcolor="#a0a0a0" stroked="f"/>
         </w:pict>
       </w:r>
     </w:p>
@@ -3814,7 +3814,7 @@
           <w:szCs w:val="20"/>
         </w:rPr>
         <w:pict w14:anchorId="0A5E75AD">
-          <v:rect id="_x0000_i1633" style="width:0;height:1.5pt" o:hralign="center" o:hrstd="t" o:hr="t" fillcolor="#a0a0a0" stroked="f"/>
+          <v:rect id="_x0000_i1027" style="width:0;height:1.5pt" o:hralign="center" o:hrstd="t" o:hr="t" fillcolor="#a0a0a0" stroked="f"/>
         </w:pict>
       </w:r>
     </w:p>
@@ -4515,7 +4515,7 @@
           <w:szCs w:val="20"/>
         </w:rPr>
         <w:pict w14:anchorId="64D52CEF">
-          <v:rect id="_x0000_i1634" style="width:0;height:1.5pt" o:hralign="center" o:hrstd="t" o:hr="t" fillcolor="#a0a0a0" stroked="f"/>
+          <v:rect id="_x0000_i1028" style="width:0;height:1.5pt" o:hralign="center" o:hrstd="t" o:hr="t" fillcolor="#a0a0a0" stroked="f"/>
         </w:pict>
       </w:r>
     </w:p>
@@ -4798,7 +4798,7 @@
           <w:szCs w:val="20"/>
         </w:rPr>
         <w:pict w14:anchorId="6129CAC7">
-          <v:rect id="_x0000_i1635" style="width:0;height:1.5pt" o:hralign="center" o:hrstd="t" o:hr="t" fillcolor="#a0a0a0" stroked="f"/>
+          <v:rect id="_x0000_i1029" style="width:0;height:1.5pt" o:hralign="center" o:hrstd="t" o:hr="t" fillcolor="#a0a0a0" stroked="f"/>
         </w:pict>
       </w:r>
     </w:p>
@@ -4977,7 +4977,7 @@
           <w:szCs w:val="20"/>
         </w:rPr>
         <w:pict w14:anchorId="1B551B19">
-          <v:rect id="_x0000_i1636" style="width:0;height:1.5pt" o:hralign="center" o:hrstd="t" o:hr="t" fillcolor="#a0a0a0" stroked="f"/>
+          <v:rect id="_x0000_i1030" style="width:0;height:1.5pt" o:hralign="center" o:hrstd="t" o:hr="t" fillcolor="#a0a0a0" stroked="f"/>
         </w:pict>
       </w:r>
     </w:p>
@@ -5423,7 +5423,7 @@
           <w:szCs w:val="20"/>
         </w:rPr>
         <w:pict w14:anchorId="2AFD49A7">
-          <v:rect id="_x0000_i1637" style="width:0;height:1.5pt" o:hralign="center" o:hrstd="t" o:hr="t" fillcolor="#a0a0a0" stroked="f"/>
+          <v:rect id="_x0000_i1031" style="width:0;height:1.5pt" o:hralign="center" o:hrstd="t" o:hr="t" fillcolor="#a0a0a0" stroked="f"/>
         </w:pict>
       </w:r>
     </w:p>
@@ -5721,7 +5721,7 @@
           <w:szCs w:val="20"/>
         </w:rPr>
         <w:pict w14:anchorId="51FF4EA7">
-          <v:rect id="_x0000_i1638" style="width:0;height:1.5pt" o:hralign="center" o:hrstd="t" o:hr="t" fillcolor="#a0a0a0" stroked="f"/>
+          <v:rect id="_x0000_i1032" style="width:0;height:1.5pt" o:hralign="center" o:hrstd="t" o:hr="t" fillcolor="#a0a0a0" stroked="f"/>
         </w:pict>
       </w:r>
     </w:p>
@@ -6234,7 +6234,7 @@
           <w:szCs w:val="20"/>
         </w:rPr>
         <w:pict w14:anchorId="24F52CA7">
-          <v:rect id="_x0000_i1684" style="width:0;height:1.5pt" o:hralign="center" o:hrstd="t" o:hr="t" fillcolor="#a0a0a0" stroked="f"/>
+          <v:rect id="_x0000_i1033" style="width:0;height:1.5pt" o:hralign="center" o:hrstd="t" o:hr="t" fillcolor="#a0a0a0" stroked="f"/>
         </w:pict>
       </w:r>
     </w:p>
@@ -6913,7 +6913,7 @@
           <w:szCs w:val="18"/>
         </w:rPr>
         <w:pict w14:anchorId="195DFC4D">
-          <v:rect id="_x0000_i1686" style="width:0;height:1.5pt" o:hralign="center" o:hrstd="t" o:hr="t" fillcolor="#a0a0a0" stroked="f"/>
+          <v:rect id="_x0000_i1034" style="width:0;height:1.5pt" o:hralign="center" o:hrstd="t" o:hr="t" fillcolor="#a0a0a0" stroked="f"/>
         </w:pict>
       </w:r>
     </w:p>
@@ -7005,7 +7005,7 @@
           <w:szCs w:val="18"/>
         </w:rPr>
         <w:pict w14:anchorId="56C031B2">
-          <v:rect id="_x0000_i1025" style="width:0;height:1.5pt" o:hralign="center" o:hrstd="t" o:hr="t" fillcolor="#a0a0a0" stroked="f"/>
+          <v:rect id="_x0000_i1035" style="width:0;height:1.5pt" o:hralign="center" o:hrstd="t" o:hr="t" fillcolor="#a0a0a0" stroked="f"/>
         </w:pict>
       </w:r>
     </w:p>
@@ -7560,7 +7560,7 @@
           <w:szCs w:val="18"/>
         </w:rPr>
         <w:pict w14:anchorId="263F5C6C">
-          <v:rect id="_x0000_i1026" style="width:0;height:1.5pt" o:hralign="center" o:hrstd="t" o:hr="t" fillcolor="#a0a0a0" stroked="f"/>
+          <v:rect id="_x0000_i1036" style="width:0;height:1.5pt" o:hralign="center" o:hrstd="t" o:hr="t" fillcolor="#a0a0a0" stroked="f"/>
         </w:pict>
       </w:r>
     </w:p>
@@ -8095,7 +8095,7 @@
           <w:szCs w:val="18"/>
         </w:rPr>
         <w:pict w14:anchorId="332D9326">
-          <v:rect id="_x0000_i1027" style="width:0;height:1.5pt" o:hralign="center" o:hrstd="t" o:hr="t" fillcolor="#a0a0a0" stroked="f"/>
+          <v:rect id="_x0000_i1037" style="width:0;height:1.5pt" o:hralign="center" o:hrstd="t" o:hr="t" fillcolor="#a0a0a0" stroked="f"/>
         </w:pict>
       </w:r>
     </w:p>
@@ -8622,7 +8622,7 @@
           <w:szCs w:val="18"/>
         </w:rPr>
         <w:pict w14:anchorId="32047EED">
-          <v:rect id="_x0000_i1028" style="width:0;height:1.5pt" o:hralign="center" o:hrstd="t" o:hr="t" fillcolor="#a0a0a0" stroked="f"/>
+          <v:rect id="_x0000_i1038" style="width:0;height:1.5pt" o:hralign="center" o:hrstd="t" o:hr="t" fillcolor="#a0a0a0" stroked="f"/>
         </w:pict>
       </w:r>
     </w:p>
@@ -9003,7 +9003,7 @@
           <w:szCs w:val="18"/>
         </w:rPr>
         <w:pict w14:anchorId="71861972">
-          <v:rect id="_x0000_i1029" style="width:0;height:1.5pt" o:hralign="center" o:hrstd="t" o:hr="t" fillcolor="#a0a0a0" stroked="f"/>
+          <v:rect id="_x0000_i1039" style="width:0;height:1.5pt" o:hralign="center" o:hrstd="t" o:hr="t" fillcolor="#a0a0a0" stroked="f"/>
         </w:pict>
       </w:r>
     </w:p>
@@ -9430,7 +9430,7 @@
           <w:szCs w:val="18"/>
         </w:rPr>
         <w:pict w14:anchorId="6AF952A4">
-          <v:rect id="_x0000_i1032" style="width:0;height:1.5pt" o:hralign="center" o:hrstd="t" o:hr="t" fillcolor="#a0a0a0" stroked="f"/>
+          <v:rect id="_x0000_i1040" style="width:0;height:1.5pt" o:hralign="center" o:hrstd="t" o:hr="t" fillcolor="#a0a0a0" stroked="f"/>
         </w:pict>
       </w:r>
     </w:p>
@@ -9510,7 +9510,7 @@
           <w:szCs w:val="18"/>
         </w:rPr>
         <w:pict w14:anchorId="79E441C1">
-          <v:rect id="_x0000_i1033" style="width:0;height:1.5pt" o:hralign="center" o:hrstd="t" o:hr="t" fillcolor="#a0a0a0" stroked="f"/>
+          <v:rect id="_x0000_i1041" style="width:0;height:1.5pt" o:hralign="center" o:hrstd="t" o:hr="t" fillcolor="#a0a0a0" stroked="f"/>
         </w:pict>
       </w:r>
     </w:p>
@@ -9622,7 +9622,7 @@
           <w:szCs w:val="18"/>
         </w:rPr>
         <w:pict w14:anchorId="44BB83C5">
-          <v:rect id="_x0000_i1034" style="width:0;height:1.5pt" o:hralign="center" o:hrstd="t" o:hr="t" fillcolor="#a0a0a0" stroked="f"/>
+          <v:rect id="_x0000_i1042" style="width:0;height:1.5pt" o:hralign="center" o:hrstd="t" o:hr="t" fillcolor="#a0a0a0" stroked="f"/>
         </w:pict>
       </w:r>
     </w:p>
@@ -10022,7 +10022,7 @@
           <w:szCs w:val="18"/>
         </w:rPr>
         <w:pict w14:anchorId="698B6E6E">
-          <v:rect id="_x0000_i1036" style="width:0;height:1.5pt" o:hralign="center" o:hrstd="t" o:hr="t" fillcolor="#a0a0a0" stroked="f"/>
+          <v:rect id="_x0000_i1043" style="width:0;height:1.5pt" o:hralign="center" o:hrstd="t" o:hr="t" fillcolor="#a0a0a0" stroked="f"/>
         </w:pict>
       </w:r>
     </w:p>
@@ -10199,7 +10199,7 @@
           <w:szCs w:val="18"/>
         </w:rPr>
         <w:pict w14:anchorId="25186D12">
-          <v:rect id="_x0000_i1037" style="width:0;height:1.5pt" o:hralign="center" o:hrstd="t" o:hr="t" fillcolor="#a0a0a0" stroked="f"/>
+          <v:rect id="_x0000_i1044" style="width:0;height:1.5pt" o:hralign="center" o:hrstd="t" o:hr="t" fillcolor="#a0a0a0" stroked="f"/>
         </w:pict>
       </w:r>
     </w:p>
@@ -10550,7 +10550,7 @@
           <w:szCs w:val="18"/>
         </w:rPr>
         <w:pict w14:anchorId="351D0FBA">
-          <v:rect id="_x0000_i1038" style="width:0;height:1.5pt" o:hralign="center" o:hrstd="t" o:hr="t" fillcolor="#a0a0a0" stroked="f"/>
+          <v:rect id="_x0000_i1045" style="width:0;height:1.5pt" o:hralign="center" o:hrstd="t" o:hr="t" fillcolor="#a0a0a0" stroked="f"/>
         </w:pict>
       </w:r>
     </w:p>
@@ -10706,7 +10706,7 @@
           <w:szCs w:val="18"/>
         </w:rPr>
         <w:pict w14:anchorId="36F11149">
-          <v:rect id="_x0000_i1039" style="width:0;height:1.5pt" o:hralign="center" o:hrstd="t" o:hr="t" fillcolor="#a0a0a0" stroked="f"/>
+          <v:rect id="_x0000_i1046" style="width:0;height:1.5pt" o:hralign="center" o:hrstd="t" o:hr="t" fillcolor="#a0a0a0" stroked="f"/>
         </w:pict>
       </w:r>
     </w:p>
@@ -10954,7 +10954,7 @@
           <w:szCs w:val="18"/>
         </w:rPr>
         <w:pict w14:anchorId="5930F8A2">
-          <v:rect id="_x0000_i1040" style="width:0;height:1.5pt" o:hralign="center" o:hrstd="t" o:hr="t" fillcolor="#a0a0a0" stroked="f"/>
+          <v:rect id="_x0000_i1047" style="width:0;height:1.5pt" o:hralign="center" o:hrstd="t" o:hr="t" fillcolor="#a0a0a0" stroked="f"/>
         </w:pict>
       </w:r>
     </w:p>
@@ -11080,7 +11080,7 @@
           <w:szCs w:val="18"/>
         </w:rPr>
         <w:pict w14:anchorId="46BF33E5">
-          <v:rect id="_x0000_i1041" style="width:0;height:1.5pt" o:hralign="center" o:hrstd="t" o:hr="t" fillcolor="#a0a0a0" stroked="f"/>
+          <v:rect id="_x0000_i1048" style="width:0;height:1.5pt" o:hralign="center" o:hrstd="t" o:hr="t" fillcolor="#a0a0a0" stroked="f"/>
         </w:pict>
       </w:r>
     </w:p>
@@ -11800,7 +11800,7 @@
           <w:szCs w:val="18"/>
         </w:rPr>
         <w:pict w14:anchorId="3E4743D8">
-          <v:rect id="_x0000_i1042" style="width:0;height:1.5pt" o:hralign="center" o:hrstd="t" o:hr="t" fillcolor="#a0a0a0" stroked="f"/>
+          <v:rect id="_x0000_i1049" style="width:0;height:1.5pt" o:hralign="center" o:hrstd="t" o:hr="t" fillcolor="#a0a0a0" stroked="f"/>
         </w:pict>
       </w:r>
     </w:p>
@@ -12195,7 +12195,7 @@
           <w:szCs w:val="18"/>
         </w:rPr>
         <w:pict w14:anchorId="30AAF696">
-          <v:rect id="_x0000_i1044" style="width:0;height:1.5pt" o:hralign="center" o:hrstd="t" o:hr="t" fillcolor="#a0a0a0" stroked="f"/>
+          <v:rect id="_x0000_i1050" style="width:0;height:1.5pt" o:hralign="center" o:hrstd="t" o:hr="t" fillcolor="#a0a0a0" stroked="f"/>
         </w:pict>
       </w:r>
     </w:p>
@@ -12277,7 +12277,7 @@
           <w:szCs w:val="18"/>
         </w:rPr>
         <w:pict w14:anchorId="29C2B2DB">
-          <v:rect id="_x0000_i1045" style="width:0;height:1.5pt" o:hralign="center" o:hrstd="t" o:hr="t" fillcolor="#a0a0a0" stroked="f"/>
+          <v:rect id="_x0000_i1051" style="width:0;height:1.5pt" o:hralign="center" o:hrstd="t" o:hr="t" fillcolor="#a0a0a0" stroked="f"/>
         </w:pict>
       </w:r>
     </w:p>
@@ -13116,7 +13116,7 @@
           <w:szCs w:val="18"/>
         </w:rPr>
         <w:pict w14:anchorId="0DA9683F">
-          <v:rect id="_x0000_i1046" style="width:0;height:1.5pt" o:hralign="center" o:hrstd="t" o:hr="t" fillcolor="#a0a0a0" stroked="f"/>
+          <v:rect id="_x0000_i1052" style="width:0;height:1.5pt" o:hralign="center" o:hrstd="t" o:hr="t" fillcolor="#a0a0a0" stroked="f"/>
         </w:pict>
       </w:r>
     </w:p>
@@ -13430,7 +13430,7 @@
           <w:szCs w:val="18"/>
         </w:rPr>
         <w:pict w14:anchorId="3710F235">
-          <v:rect id="_x0000_i1047" style="width:0;height:1.5pt" o:hralign="center" o:hrstd="t" o:hr="t" fillcolor="#a0a0a0" stroked="f"/>
+          <v:rect id="_x0000_i1053" style="width:0;height:1.5pt" o:hralign="center" o:hrstd="t" o:hr="t" fillcolor="#a0a0a0" stroked="f"/>
         </w:pict>
       </w:r>
     </w:p>
@@ -13571,7 +13571,7 @@
           <w:szCs w:val="18"/>
         </w:rPr>
         <w:pict w14:anchorId="2028B35F">
-          <v:rect id="_x0000_i1048" style="width:0;height:1.5pt" o:hralign="center" o:hrstd="t" o:hr="t" fillcolor="#a0a0a0" stroked="f"/>
+          <v:rect id="_x0000_i1054" style="width:0;height:1.5pt" o:hralign="center" o:hrstd="t" o:hr="t" fillcolor="#a0a0a0" stroked="f"/>
         </w:pict>
       </w:r>
     </w:p>
@@ -13740,7 +13740,7 @@
           <w:szCs w:val="18"/>
         </w:rPr>
         <w:pict w14:anchorId="54760E5D">
-          <v:rect id="_x0000_i1049" style="width:0;height:1.5pt" o:hralign="center" o:hrstd="t" o:hr="t" fillcolor="#a0a0a0" stroked="f"/>
+          <v:rect id="_x0000_i1055" style="width:0;height:1.5pt" o:hralign="center" o:hrstd="t" o:hr="t" fillcolor="#a0a0a0" stroked="f"/>
         </w:pict>
       </w:r>
     </w:p>
@@ -14143,7 +14143,7 @@
           <w:szCs w:val="18"/>
         </w:rPr>
         <w:pict w14:anchorId="5011F13B">
-          <v:rect id="_x0000_i1050" style="width:0;height:1.5pt" o:hralign="center" o:hrstd="t" o:hr="t" fillcolor="#a0a0a0" stroked="f"/>
+          <v:rect id="_x0000_i1056" style="width:0;height:1.5pt" o:hralign="center" o:hrstd="t" o:hr="t" fillcolor="#a0a0a0" stroked="f"/>
         </w:pict>
       </w:r>
     </w:p>
@@ -14422,7 +14422,7 @@
           <w:szCs w:val="18"/>
         </w:rPr>
         <w:pict w14:anchorId="5B605067">
-          <v:rect id="_x0000_i1051" style="width:0;height:1.5pt" o:hralign="center" o:hrstd="t" o:hr="t" fillcolor="#a0a0a0" stroked="f"/>
+          <v:rect id="_x0000_i1057" style="width:0;height:1.5pt" o:hralign="center" o:hrstd="t" o:hr="t" fillcolor="#a0a0a0" stroked="f"/>
         </w:pict>
       </w:r>
     </w:p>
@@ -14439,7 +14439,7 @@
           <w:szCs w:val="18"/>
         </w:rPr>
         <w:pict w14:anchorId="2D70432B">
-          <v:rect id="_x0000_i1056" style="width:0;height:1.5pt" o:hralign="center" o:hrstd="t" o:hr="t" fillcolor="#a0a0a0" stroked="f"/>
+          <v:rect id="_x0000_i1058" style="width:0;height:1.5pt" o:hralign="center" o:hrstd="t" o:hr="t" fillcolor="#a0a0a0" stroked="f"/>
         </w:pict>
       </w:r>
     </w:p>
@@ -14697,7 +14697,7 @@
           <w:szCs w:val="18"/>
         </w:rPr>
         <w:pict w14:anchorId="265D6E4D">
-          <v:rect id="_x0000_i1063" style="width:0;height:1.5pt" o:hralign="center" o:hrstd="t" o:hr="t" fillcolor="#a0a0a0" stroked="f"/>
+          <v:rect id="_x0000_i1059" style="width:0;height:1.5pt" o:hralign="center" o:hrstd="t" o:hr="t" fillcolor="#a0a0a0" stroked="f"/>
         </w:pict>
       </w:r>
     </w:p>
@@ -14891,7 +14891,7 @@
           <w:szCs w:val="18"/>
         </w:rPr>
         <w:pict w14:anchorId="695D4308">
-          <v:rect id="_x0000_i1064" style="width:0;height:1.5pt" o:hralign="center" o:hrstd="t" o:hr="t" fillcolor="#a0a0a0" stroked="f"/>
+          <v:rect id="_x0000_i1060" style="width:0;height:1.5pt" o:hralign="center" o:hrstd="t" o:hr="t" fillcolor="#a0a0a0" stroked="f"/>
         </w:pict>
       </w:r>
     </w:p>
@@ -15267,7 +15267,7 @@
           <w:szCs w:val="18"/>
         </w:rPr>
         <w:pict w14:anchorId="39E1798D">
-          <v:rect id="_x0000_i1703" style="width:0;height:1.5pt" o:hralign="center" o:bullet="t" o:hrstd="t" o:hr="t" fillcolor="#a0a0a0" stroked="f"/>
+          <v:rect id="_x0000_i1061" style="width:0;height:1.5pt" o:hralign="center" o:bullet="t" o:hrstd="t" o:hr="t" fillcolor="#a0a0a0" stroked="f"/>
         </w:pict>
       </w:r>
     </w:p>
@@ -15334,7 +15334,7 @@
           <w:szCs w:val="18"/>
         </w:rPr>
         <w:pict w14:anchorId="60DCFA7E">
-          <v:rect id="_x0000_i1758" style="width:0;height:1.5pt" o:hralign="center" o:hrstd="t" o:hr="t" fillcolor="#a0a0a0" stroked="f"/>
+          <v:rect id="_x0000_i1062" style="width:0;height:1.5pt" o:hralign="center" o:hrstd="t" o:hr="t" fillcolor="#a0a0a0" stroked="f"/>
         </w:pict>
       </w:r>
     </w:p>
@@ -15761,7 +15761,7 @@
           <w:szCs w:val="18"/>
         </w:rPr>
         <w:pict w14:anchorId="1882975B">
-          <v:rect id="_x0000_i1759" style="width:0;height:1.5pt" o:hralign="center" o:hrstd="t" o:hr="t" fillcolor="#a0a0a0" stroked="f"/>
+          <v:rect id="_x0000_i1063" style="width:0;height:1.5pt" o:hralign="center" o:hrstd="t" o:hr="t" fillcolor="#a0a0a0" stroked="f"/>
         </w:pict>
       </w:r>
     </w:p>
@@ -16129,7 +16129,7 @@
           <w:szCs w:val="18"/>
         </w:rPr>
         <w:pict w14:anchorId="64F540E5">
-          <v:rect id="_x0000_i1760" style="width:0;height:1.5pt" o:hralign="center" o:hrstd="t" o:hr="t" fillcolor="#a0a0a0" stroked="f"/>
+          <v:rect id="_x0000_i1064" style="width:0;height:1.5pt" o:hralign="center" o:hrstd="t" o:hr="t" fillcolor="#a0a0a0" stroked="f"/>
         </w:pict>
       </w:r>
     </w:p>
@@ -16568,7 +16568,7 @@
           <w:szCs w:val="18"/>
         </w:rPr>
         <w:pict w14:anchorId="2FC76BEE">
-          <v:rect id="_x0000_i1761" style="width:0;height:1.5pt" o:hralign="center" o:hrstd="t" o:hr="t" fillcolor="#a0a0a0" stroked="f"/>
+          <v:rect id="_x0000_i1065" style="width:0;height:1.5pt" o:hralign="center" o:hrstd="t" o:hr="t" fillcolor="#a0a0a0" stroked="f"/>
         </w:pict>
       </w:r>
     </w:p>
@@ -17264,7 +17264,7 @@
           <w:szCs w:val="18"/>
         </w:rPr>
         <w:pict w14:anchorId="41B174D8">
-          <v:rect id="_x0000_i1763" style="width:0;height:1.5pt" o:hralign="center" o:hrstd="t" o:hr="t" fillcolor="#a0a0a0" stroked="f"/>
+          <v:rect id="_x0000_i1066" style="width:0;height:1.5pt" o:hralign="center" o:hrstd="t" o:hr="t" fillcolor="#a0a0a0" stroked="f"/>
         </w:pict>
       </w:r>
     </w:p>
@@ -17553,7 +17553,7 @@
           <w:szCs w:val="18"/>
         </w:rPr>
         <w:pict w14:anchorId="4FDC5530">
-          <v:rect id="_x0000_i1764" style="width:0;height:1.5pt" o:hralign="center" o:hrstd="t" o:hr="t" fillcolor="#a0a0a0" stroked="f"/>
+          <v:rect id="_x0000_i1067" style="width:0;height:1.5pt" o:hralign="center" o:hrstd="t" o:hr="t" fillcolor="#a0a0a0" stroked="f"/>
         </w:pict>
       </w:r>
     </w:p>
@@ -18110,7 +18110,7 @@
           <w:szCs w:val="18"/>
         </w:rPr>
         <w:pict w14:anchorId="52BD00A8">
-          <v:rect id="_x0000_i1765" style="width:0;height:1.5pt" o:hralign="center" o:hrstd="t" o:hr="t" fillcolor="#a0a0a0" stroked="f"/>
+          <v:rect id="_x0000_i1068" style="width:0;height:1.5pt" o:hralign="center" o:hrstd="t" o:hr="t" fillcolor="#a0a0a0" stroked="f"/>
         </w:pict>
       </w:r>
     </w:p>
@@ -18522,7 +18522,7 @@
           <w:szCs w:val="18"/>
         </w:rPr>
         <w:pict w14:anchorId="2EFB3F06">
-          <v:rect id="_x0000_i1066" style="width:0;height:1.5pt" o:hralign="center" o:hrstd="t" o:hr="t" fillcolor="#a0a0a0" stroked="f"/>
+          <v:rect id="_x0000_i1069" style="width:0;height:1.5pt" o:hralign="center" o:hrstd="t" o:hr="t" fillcolor="#a0a0a0" stroked="f"/>
         </w:pict>
       </w:r>
     </w:p>
@@ -18735,7 +18735,7 @@
           <w:szCs w:val="18"/>
         </w:rPr>
         <w:pict w14:anchorId="77AD9155">
-          <v:rect id="_x0000_i1067" style="width:0;height:1.5pt" o:hralign="center" o:hrstd="t" o:hr="t" fillcolor="#a0a0a0" stroked="f"/>
+          <v:rect id="_x0000_i1070" style="width:0;height:1.5pt" o:hralign="center" o:hrstd="t" o:hr="t" fillcolor="#a0a0a0" stroked="f"/>
         </w:pict>
       </w:r>
     </w:p>
@@ -18816,7 +18816,7 @@
           <w:szCs w:val="18"/>
         </w:rPr>
         <w:pict w14:anchorId="58AD6702">
-          <v:rect id="_x0000_i1068" style="width:0;height:1.5pt" o:hralign="center" o:hrstd="t" o:hr="t" fillcolor="#a0a0a0" stroked="f"/>
+          <v:rect id="_x0000_i1071" style="width:0;height:1.5pt" o:hralign="center" o:hrstd="t" o:hr="t" fillcolor="#a0a0a0" stroked="f"/>
         </w:pict>
       </w:r>
     </w:p>
@@ -18942,7 +18942,7 @@
           <w:szCs w:val="18"/>
         </w:rPr>
         <w:pict w14:anchorId="0F559EC2">
-          <v:rect id="_x0000_i1069" style="width:0;height:1.5pt" o:hralign="center" o:hrstd="t" o:hr="t" fillcolor="#a0a0a0" stroked="f"/>
+          <v:rect id="_x0000_i1072" style="width:0;height:1.5pt" o:hralign="center" o:hrstd="t" o:hr="t" fillcolor="#a0a0a0" stroked="f"/>
         </w:pict>
       </w:r>
     </w:p>
@@ -19238,7 +19238,7 @@
           <w:szCs w:val="18"/>
         </w:rPr>
         <w:pict w14:anchorId="62B82296">
-          <v:rect id="_x0000_i1070" style="width:0;height:1.5pt" o:hralign="center" o:hrstd="t" o:hr="t" fillcolor="#a0a0a0" stroked="f"/>
+          <v:rect id="_x0000_i1073" style="width:0;height:1.5pt" o:hralign="center" o:hrstd="t" o:hr="t" fillcolor="#a0a0a0" stroked="f"/>
         </w:pict>
       </w:r>
     </w:p>
@@ -19340,7 +19340,7 @@
           <w:szCs w:val="18"/>
         </w:rPr>
         <w:pict w14:anchorId="4D13B17A">
-          <v:rect id="_x0000_i1071" style="width:0;height:1.5pt" o:hralign="center" o:hrstd="t" o:hr="t" fillcolor="#a0a0a0" stroked="f"/>
+          <v:rect id="_x0000_i1074" style="width:0;height:1.5pt" o:hralign="center" o:hrstd="t" o:hr="t" fillcolor="#a0a0a0" stroked="f"/>
         </w:pict>
       </w:r>
     </w:p>
@@ -19421,7 +19421,7 @@
           <w:szCs w:val="18"/>
         </w:rPr>
         <w:pict w14:anchorId="078C7F1F">
-          <v:rect id="_x0000_i1072" style="width:0;height:1.5pt" o:hralign="center" o:hrstd="t" o:hr="t" fillcolor="#a0a0a0" stroked="f"/>
+          <v:rect id="_x0000_i1075" style="width:0;height:1.5pt" o:hralign="center" o:hrstd="t" o:hr="t" fillcolor="#a0a0a0" stroked="f"/>
         </w:pict>
       </w:r>
     </w:p>
@@ -19472,7 +19472,7 @@
           <w:szCs w:val="18"/>
         </w:rPr>
         <w:pict w14:anchorId="33F58E05">
-          <v:rect id="_x0000_i1073" style="width:0;height:1.5pt" o:hralign="center" o:hrstd="t" o:hr="t" fillcolor="#a0a0a0" stroked="f"/>
+          <v:rect id="_x0000_i1076" style="width:0;height:1.5pt" o:hralign="center" o:hrstd="t" o:hr="t" fillcolor="#a0a0a0" stroked="f"/>
         </w:pict>
       </w:r>
     </w:p>
@@ -19651,7 +19651,7 @@
           <w:szCs w:val="18"/>
         </w:rPr>
         <w:pict w14:anchorId="6E5633C6">
-          <v:rect id="_x0000_i1074" style="width:0;height:1.5pt" o:hralign="center" o:hrstd="t" o:hr="t" fillcolor="#a0a0a0" stroked="f"/>
+          <v:rect id="_x0000_i1077" style="width:0;height:1.5pt" o:hralign="center" o:hrstd="t" o:hr="t" fillcolor="#a0a0a0" stroked="f"/>
         </w:pict>
       </w:r>
     </w:p>
@@ -19848,7 +19848,7 @@
           <w:szCs w:val="18"/>
         </w:rPr>
         <w:pict w14:anchorId="7C0D2A96">
-          <v:rect id="_x0000_i1075" style="width:0;height:1.5pt" o:hralign="center" o:hrstd="t" o:hr="t" fillcolor="#a0a0a0" stroked="f"/>
+          <v:rect id="_x0000_i1078" style="width:0;height:1.5pt" o:hralign="center" o:hrstd="t" o:hr="t" fillcolor="#a0a0a0" stroked="f"/>
         </w:pict>
       </w:r>
     </w:p>
@@ -19988,7 +19988,7 @@
           <w:szCs w:val="18"/>
         </w:rPr>
         <w:pict w14:anchorId="2027BFD8">
-          <v:rect id="_x0000_i1076" style="width:0;height:1.5pt" o:hralign="center" o:hrstd="t" o:hr="t" fillcolor="#a0a0a0" stroked="f"/>
+          <v:rect id="_x0000_i1079" style="width:0;height:1.5pt" o:hralign="center" o:hrstd="t" o:hr="t" fillcolor="#a0a0a0" stroked="f"/>
         </w:pict>
       </w:r>
     </w:p>
@@ -20086,7 +20086,7 @@
           <w:szCs w:val="18"/>
         </w:rPr>
         <w:pict w14:anchorId="45B55DE9">
-          <v:rect id="_x0000_i1077" style="width:0;height:1.5pt" o:hralign="center" o:hrstd="t" o:hr="t" fillcolor="#a0a0a0" stroked="f"/>
+          <v:rect id="_x0000_i1080" style="width:0;height:1.5pt" o:hralign="center" o:hrstd="t" o:hr="t" fillcolor="#a0a0a0" stroked="f"/>
         </w:pict>
       </w:r>
     </w:p>
@@ -20383,7 +20383,7 @@
           <w:szCs w:val="18"/>
         </w:rPr>
         <w:pict w14:anchorId="59E08D7B">
-          <v:rect id="_x0000_i1078" style="width:0;height:1.5pt" o:hralign="center" o:hrstd="t" o:hr="t" fillcolor="#a0a0a0" stroked="f"/>
+          <v:rect id="_x0000_i1081" style="width:0;height:1.5pt" o:hralign="center" o:hrstd="t" o:hr="t" fillcolor="#a0a0a0" stroked="f"/>
         </w:pict>
       </w:r>
     </w:p>
@@ -20485,7 +20485,7 @@
           <w:szCs w:val="18"/>
         </w:rPr>
         <w:pict w14:anchorId="16A09FB9">
-          <v:rect id="_x0000_i1079" style="width:0;height:1.5pt" o:hralign="center" o:hrstd="t" o:hr="t" fillcolor="#a0a0a0" stroked="f"/>
+          <v:rect id="_x0000_i1082" style="width:0;height:1.5pt" o:hralign="center" o:hrstd="t" o:hr="t" fillcolor="#a0a0a0" stroked="f"/>
         </w:pict>
       </w:r>
     </w:p>
@@ -20536,7 +20536,7 @@
           <w:szCs w:val="18"/>
         </w:rPr>
         <w:pict w14:anchorId="2B1C2F3C">
-          <v:rect id="_x0000_i1080" style="width:0;height:1.5pt" o:hralign="center" o:hrstd="t" o:hr="t" fillcolor="#a0a0a0" stroked="f"/>
+          <v:rect id="_x0000_i1083" style="width:0;height:1.5pt" o:hralign="center" o:hrstd="t" o:hr="t" fillcolor="#a0a0a0" stroked="f"/>
         </w:pict>
       </w:r>
     </w:p>
@@ -20883,7 +20883,7 @@
           <w:szCs w:val="18"/>
         </w:rPr>
         <w:pict w14:anchorId="6714B4EE">
-          <v:rect id="_x0000_i1081" style="width:0;height:1.5pt" o:hralign="center" o:hrstd="t" o:hr="t" fillcolor="#a0a0a0" stroked="f"/>
+          <v:rect id="_x0000_i1084" style="width:0;height:1.5pt" o:hralign="center" o:hrstd="t" o:hr="t" fillcolor="#a0a0a0" stroked="f"/>
         </w:pict>
       </w:r>
     </w:p>
@@ -21252,7 +21252,7 @@
           <w:szCs w:val="18"/>
         </w:rPr>
         <w:pict w14:anchorId="59344350">
-          <v:rect id="_x0000_i1082" style="width:0;height:1.5pt" o:hralign="center" o:hrstd="t" o:hr="t" fillcolor="#a0a0a0" stroked="f"/>
+          <v:rect id="_x0000_i1085" style="width:0;height:1.5pt" o:hralign="center" o:hrstd="t" o:hr="t" fillcolor="#a0a0a0" stroked="f"/>
         </w:pict>
       </w:r>
     </w:p>
@@ -21464,7 +21464,7 @@
           <w:szCs w:val="18"/>
         </w:rPr>
         <w:pict w14:anchorId="45073851">
-          <v:rect id="_x0000_i1083" style="width:0;height:1.5pt" o:hralign="center" o:hrstd="t" o:hr="t" fillcolor="#a0a0a0" stroked="f"/>
+          <v:rect id="_x0000_i1086" style="width:0;height:1.5pt" o:hralign="center" o:hrstd="t" o:hr="t" fillcolor="#a0a0a0" stroked="f"/>
         </w:pict>
       </w:r>
     </w:p>
@@ -21546,7 +21546,7 @@
           <w:szCs w:val="18"/>
         </w:rPr>
         <w:pict w14:anchorId="41086214">
-          <v:rect id="_x0000_i1084" style="width:0;height:1.5pt" o:hralign="center" o:hrstd="t" o:hr="t" fillcolor="#a0a0a0" stroked="f"/>
+          <v:rect id="_x0000_i1087" style="width:0;height:1.5pt" o:hralign="center" o:hrstd="t" o:hr="t" fillcolor="#a0a0a0" stroked="f"/>
         </w:pict>
       </w:r>
     </w:p>
@@ -22259,7 +22259,7 @@
           <w:szCs w:val="18"/>
         </w:rPr>
         <w:pict w14:anchorId="79A76D42">
-          <v:rect id="_x0000_i1085" style="width:0;height:1.5pt" o:hralign="center" o:hrstd="t" o:hr="t" fillcolor="#a0a0a0" stroked="f"/>
+          <v:rect id="_x0000_i1088" style="width:0;height:1.5pt" o:hralign="center" o:hrstd="t" o:hr="t" fillcolor="#a0a0a0" stroked="f"/>
         </w:pict>
       </w:r>
     </w:p>
@@ -22738,7 +22738,7 @@
           <w:szCs w:val="18"/>
         </w:rPr>
         <w:pict w14:anchorId="27176E92">
-          <v:rect id="_x0000_i1086" style="width:0;height:1.5pt" o:hralign="center" o:hrstd="t" o:hr="t" fillcolor="#a0a0a0" stroked="f"/>
+          <v:rect id="_x0000_i1089" style="width:0;height:1.5pt" o:hralign="center" o:hrstd="t" o:hr="t" fillcolor="#a0a0a0" stroked="f"/>
         </w:pict>
       </w:r>
     </w:p>
@@ -23427,7 +23427,7 @@
           <w:szCs w:val="18"/>
         </w:rPr>
         <w:pict w14:anchorId="2A602350">
-          <v:rect id="_x0000_i1087" style="width:0;height:1.5pt" o:hralign="center" o:hrstd="t" o:hr="t" fillcolor="#a0a0a0" stroked="f"/>
+          <v:rect id="_x0000_i1090" style="width:0;height:1.5pt" o:hralign="center" o:hrstd="t" o:hr="t" fillcolor="#a0a0a0" stroked="f"/>
         </w:pict>
       </w:r>
     </w:p>
@@ -23769,7 +23769,7 @@
           <w:szCs w:val="18"/>
         </w:rPr>
         <w:pict w14:anchorId="453785F6">
-          <v:rect id="_x0000_i1088" style="width:0;height:1.5pt" o:hralign="center" o:hrstd="t" o:hr="t" fillcolor="#a0a0a0" stroked="f"/>
+          <v:rect id="_x0000_i1091" style="width:0;height:1.5pt" o:hralign="center" o:hrstd="t" o:hr="t" fillcolor="#a0a0a0" stroked="f"/>
         </w:pict>
       </w:r>
     </w:p>
@@ -24294,7 +24294,7 @@
           <w:szCs w:val="18"/>
         </w:rPr>
         <w:pict w14:anchorId="6B67A9D5">
-          <v:rect id="_x0000_i1089" style="width:0;height:1.5pt" o:hralign="center" o:hrstd="t" o:hr="t" fillcolor="#a0a0a0" stroked="f"/>
+          <v:rect id="_x0000_i1092" style="width:0;height:1.5pt" o:hralign="center" o:hrstd="t" o:hr="t" fillcolor="#a0a0a0" stroked="f"/>
         </w:pict>
       </w:r>
     </w:p>
@@ -24635,7 +24635,7 @@
           <w:szCs w:val="18"/>
         </w:rPr>
         <w:pict w14:anchorId="02EB43B3">
-          <v:rect id="_x0000_i1090" style="width:0;height:1.5pt" o:hralign="center" o:hrstd="t" o:hr="t" fillcolor="#a0a0a0" stroked="f"/>
+          <v:rect id="_x0000_i1093" style="width:0;height:1.5pt" o:hralign="center" o:hrstd="t" o:hr="t" fillcolor="#a0a0a0" stroked="f"/>
         </w:pict>
       </w:r>
     </w:p>
@@ -24804,7 +24804,7 @@
           <w:szCs w:val="18"/>
         </w:rPr>
         <w:pict w14:anchorId="1690CC1F">
-          <v:rect id="_x0000_i1091" style="width:0;height:1.5pt" o:hralign="center" o:hrstd="t" o:hr="t" fillcolor="#a0a0a0" stroked="f"/>
+          <v:rect id="_x0000_i1094" style="width:0;height:1.5pt" o:hralign="center" o:hrstd="t" o:hr="t" fillcolor="#a0a0a0" stroked="f"/>
         </w:pict>
       </w:r>
     </w:p>
@@ -24960,7 +24960,7 @@
           <w:szCs w:val="18"/>
         </w:rPr>
         <w:pict w14:anchorId="4BF38D8A">
-          <v:rect id="_x0000_i1092" style="width:0;height:1.5pt" o:hralign="center" o:hrstd="t" o:hr="t" fillcolor="#a0a0a0" stroked="f"/>
+          <v:rect id="_x0000_i1095" style="width:0;height:1.5pt" o:hralign="center" o:hrstd="t" o:hr="t" fillcolor="#a0a0a0" stroked="f"/>
         </w:pict>
       </w:r>
     </w:p>
@@ -25012,14 +25012,13 @@
         </w:rPr>
         <w:t>Example:</w:t>
       </w:r>
-    </w:p>
-    <w:p>
-      <w:pPr>
-        <w:rPr>
-          <w:sz w:val="18"/>
-          <w:szCs w:val="18"/>
-        </w:rPr>
-      </w:pPr>
+      <w:r>
+        <w:rPr>
+          <w:sz w:val="18"/>
+          <w:szCs w:val="18"/>
+        </w:rPr>
+        <w:t xml:space="preserve"> </w:t>
+      </w:r>
       <w:r>
         <w:rPr>
           <w:sz w:val="18"/>
@@ -25070,22 +25069,22 @@
           <w:sz w:val="18"/>
           <w:szCs w:val="18"/>
         </w:rPr>
+        <w:t xml:space="preserve">    public static void main(String[] args) {</w:t>
+      </w:r>
+    </w:p>
+    <w:p>
+      <w:pPr>
+        <w:rPr>
+          <w:sz w:val="18"/>
+          <w:szCs w:val="18"/>
+        </w:rPr>
+      </w:pPr>
+      <w:r>
+        <w:rPr>
+          <w:sz w:val="18"/>
+          <w:szCs w:val="18"/>
+        </w:rPr>
         <w:lastRenderedPageBreak/>
-        <w:t xml:space="preserve">    public static void main(String[] args) {</w:t>
-      </w:r>
-    </w:p>
-    <w:p>
-      <w:pPr>
-        <w:rPr>
-          <w:sz w:val="18"/>
-          <w:szCs w:val="18"/>
-        </w:rPr>
-      </w:pPr>
-      <w:r>
-        <w:rPr>
-          <w:sz w:val="18"/>
-          <w:szCs w:val="18"/>
-        </w:rPr>
         <w:t xml:space="preserve">        int a;</w:t>
       </w:r>
     </w:p>
@@ -25162,7 +25161,7 @@
           <w:szCs w:val="18"/>
         </w:rPr>
         <w:pict w14:anchorId="5989D487">
-          <v:rect id="_x0000_i1093" style="width:0;height:1.5pt" o:hralign="center" o:hrstd="t" o:hr="t" fillcolor="#a0a0a0" stroked="f"/>
+          <v:rect id="_x0000_i1096" style="width:0;height:1.5pt" o:hralign="center" o:hrstd="t" o:hr="t" fillcolor="#a0a0a0" stroked="f"/>
         </w:pict>
       </w:r>
     </w:p>
@@ -25518,7 +25517,7 @@
           <w:szCs w:val="18"/>
         </w:rPr>
         <w:pict w14:anchorId="17AB2061">
-          <v:rect id="_x0000_i1094" style="width:0;height:1.5pt" o:hralign="center" o:hrstd="t" o:hr="t" fillcolor="#a0a0a0" stroked="f"/>
+          <v:rect id="_x0000_i1097" style="width:0;height:1.5pt" o:hralign="center" o:hrstd="t" o:hr="t" fillcolor="#a0a0a0" stroked="f"/>
         </w:pict>
       </w:r>
     </w:p>
@@ -25727,7 +25726,7 @@
           <w:szCs w:val="18"/>
         </w:rPr>
         <w:pict w14:anchorId="1B05DAD8">
-          <v:rect id="_x0000_i1095" style="width:0;height:1.5pt" o:hralign="center" o:hrstd="t" o:hr="t" fillcolor="#a0a0a0" stroked="f"/>
+          <v:rect id="_x0000_i1098" style="width:0;height:1.5pt" o:hralign="center" o:hrstd="t" o:hr="t" fillcolor="#a0a0a0" stroked="f"/>
         </w:pict>
       </w:r>
     </w:p>
@@ -25883,22 +25882,22 @@
           <w:sz w:val="18"/>
           <w:szCs w:val="18"/>
         </w:rPr>
+        <w:t>Example usage:</w:t>
+      </w:r>
+    </w:p>
+    <w:p>
+      <w:pPr>
+        <w:rPr>
+          <w:sz w:val="18"/>
+          <w:szCs w:val="18"/>
+        </w:rPr>
+      </w:pPr>
+      <w:r>
+        <w:rPr>
+          <w:sz w:val="18"/>
+          <w:szCs w:val="18"/>
+        </w:rPr>
         <w:lastRenderedPageBreak/>
-        <w:t>Example usage:</w:t>
-      </w:r>
-    </w:p>
-    <w:p>
-      <w:pPr>
-        <w:rPr>
-          <w:sz w:val="18"/>
-          <w:szCs w:val="18"/>
-        </w:rPr>
-      </w:pPr>
-      <w:r>
-        <w:rPr>
-          <w:sz w:val="18"/>
-          <w:szCs w:val="18"/>
-        </w:rPr>
         <w:t>Student s1 = new Student();</w:t>
       </w:r>
     </w:p>
@@ -25930,7 +25929,7 @@
           <w:szCs w:val="18"/>
         </w:rPr>
         <w:pict w14:anchorId="4AA94D63">
-          <v:rect id="_x0000_i1096" style="width:0;height:1.5pt" o:hralign="center" o:hrstd="t" o:hr="t" fillcolor="#a0a0a0" stroked="f"/>
+          <v:rect id="_x0000_i1099" style="width:0;height:1.5pt" o:hralign="center" o:hrstd="t" o:hr="t" fillcolor="#a0a0a0" stroked="f"/>
         </w:pict>
       </w:r>
     </w:p>
@@ -26088,7 +26087,7 @@
           <w:szCs w:val="18"/>
         </w:rPr>
         <w:pict w14:anchorId="5C0A9C4A">
-          <v:rect id="_x0000_i1097" style="width:0;height:1.5pt" o:hralign="center" o:hrstd="t" o:hr="t" fillcolor="#a0a0a0" stroked="f"/>
+          <v:rect id="_x0000_i1100" style="width:0;height:1.5pt" o:hralign="center" o:hrstd="t" o:hr="t" fillcolor="#a0a0a0" stroked="f"/>
         </w:pict>
       </w:r>
     </w:p>
@@ -26367,7 +26366,7 @@
           <w:szCs w:val="18"/>
         </w:rPr>
         <w:pict w14:anchorId="1E1AAE1C">
-          <v:rect id="_x0000_i1098" style="width:0;height:1.5pt" o:hralign="center" o:hrstd="t" o:hr="t" fillcolor="#a0a0a0" stroked="f"/>
+          <v:rect id="_x0000_i1101" style="width:0;height:1.5pt" o:hralign="center" o:hrstd="t" o:hr="t" fillcolor="#a0a0a0" stroked="f"/>
         </w:pict>
       </w:r>
     </w:p>
@@ -26615,7 +26614,7 @@
           <w:szCs w:val="18"/>
         </w:rPr>
         <w:pict w14:anchorId="009618E1">
-          <v:rect id="_x0000_i1099" style="width:0;height:1.5pt" o:hralign="center" o:hrstd="t" o:hr="t" fillcolor="#a0a0a0" stroked="f"/>
+          <v:rect id="_x0000_i1102" style="width:0;height:1.5pt" o:hralign="center" o:hrstd="t" o:hr="t" fillcolor="#a0a0a0" stroked="f"/>
         </w:pict>
       </w:r>
     </w:p>
@@ -26799,22 +26798,22 @@
           <w:sz w:val="18"/>
           <w:szCs w:val="18"/>
         </w:rPr>
+        <w:t xml:space="preserve">        s1.roll = 101;</w:t>
+      </w:r>
+    </w:p>
+    <w:p>
+      <w:pPr>
+        <w:rPr>
+          <w:sz w:val="18"/>
+          <w:szCs w:val="18"/>
+        </w:rPr>
+      </w:pPr>
+      <w:r>
+        <w:rPr>
+          <w:sz w:val="18"/>
+          <w:szCs w:val="18"/>
+        </w:rPr>
         <w:lastRenderedPageBreak/>
-        <w:t xml:space="preserve">        s1.roll = 101;</w:t>
-      </w:r>
-    </w:p>
-    <w:p>
-      <w:pPr>
-        <w:rPr>
-          <w:sz w:val="18"/>
-          <w:szCs w:val="18"/>
-        </w:rPr>
-      </w:pPr>
-      <w:r>
-        <w:rPr>
-          <w:sz w:val="18"/>
-          <w:szCs w:val="18"/>
-        </w:rPr>
         <w:t xml:space="preserve">        s1.display();</w:t>
       </w:r>
     </w:p>
@@ -26861,7 +26860,7 @@
           <w:szCs w:val="18"/>
         </w:rPr>
         <w:pict w14:anchorId="783EC51B">
-          <v:rect id="_x0000_i1100" style="width:0;height:1.5pt" o:hralign="center" o:hrstd="t" o:hr="t" fillcolor="#a0a0a0" stroked="f"/>
+          <v:rect id="_x0000_i1103" style="width:0;height:1.5pt" o:hralign="center" o:hrstd="t" o:hr="t" fillcolor="#a0a0a0" stroked="f"/>
         </w:pict>
       </w:r>
     </w:p>
@@ -27077,7 +27076,7 @@
           <w:szCs w:val="18"/>
         </w:rPr>
         <w:pict w14:anchorId="1B1C863C">
-          <v:rect id="_x0000_i1101" style="width:0;height:1.5pt" o:hralign="center" o:hrstd="t" o:hr="t" fillcolor="#a0a0a0" stroked="f"/>
+          <v:rect id="_x0000_i1104" style="width:0;height:1.5pt" o:hralign="center" o:hrstd="t" o:hr="t" fillcolor="#a0a0a0" stroked="f"/>
         </w:pict>
       </w:r>
     </w:p>
@@ -27373,7 +27372,7 @@
           <w:szCs w:val="18"/>
         </w:rPr>
         <w:pict w14:anchorId="30567527">
-          <v:rect id="_x0000_i1102" style="width:0;height:1.5pt" o:hralign="center" o:hrstd="t" o:hr="t" fillcolor="#a0a0a0" stroked="f"/>
+          <v:rect id="_x0000_i1105" style="width:0;height:1.5pt" o:hralign="center" o:hrstd="t" o:hr="t" fillcolor="#a0a0a0" stroked="f"/>
         </w:pict>
       </w:r>
     </w:p>
@@ -27898,7 +27897,7 @@
           <w:szCs w:val="18"/>
         </w:rPr>
         <w:pict w14:anchorId="7FD92C56">
-          <v:rect id="_x0000_i1103" style="width:0;height:1.5pt" o:hralign="center" o:hrstd="t" o:hr="t" fillcolor="#a0a0a0" stroked="f"/>
+          <v:rect id="_x0000_i1106" style="width:0;height:1.5pt" o:hralign="center" o:hrstd="t" o:hr="t" fillcolor="#a0a0a0" stroked="f"/>
         </w:pict>
       </w:r>
     </w:p>
@@ -27918,22 +27917,22 @@
           <w:sz w:val="18"/>
           <w:szCs w:val="18"/>
         </w:rPr>
+        <w:t>Example Program Using Keywords</w:t>
+      </w:r>
+    </w:p>
+    <w:p>
+      <w:pPr>
+        <w:rPr>
+          <w:sz w:val="18"/>
+          <w:szCs w:val="18"/>
+        </w:rPr>
+      </w:pPr>
+      <w:r>
+        <w:rPr>
+          <w:sz w:val="18"/>
+          <w:szCs w:val="18"/>
+        </w:rPr>
         <w:lastRenderedPageBreak/>
-        <w:t>Example Program Using Keywords</w:t>
-      </w:r>
-    </w:p>
-    <w:p>
-      <w:pPr>
-        <w:rPr>
-          <w:sz w:val="18"/>
-          <w:szCs w:val="18"/>
-        </w:rPr>
-      </w:pPr>
-      <w:r>
-        <w:rPr>
-          <w:sz w:val="18"/>
-          <w:szCs w:val="18"/>
-        </w:rPr>
         <w:t>class KeywordExample {</w:t>
       </w:r>
     </w:p>
@@ -28084,7 +28083,7 @@
           <w:szCs w:val="18"/>
         </w:rPr>
         <w:pict w14:anchorId="4986D0E8">
-          <v:rect id="_x0000_i1104" style="width:0;height:1.5pt" o:hralign="center" o:hrstd="t" o:hr="t" fillcolor="#a0a0a0" stroked="f"/>
+          <v:rect id="_x0000_i1107" style="width:0;height:1.5pt" o:hralign="center" o:hrstd="t" o:hr="t" fillcolor="#a0a0a0" stroked="f"/>
         </w:pict>
       </w:r>
     </w:p>
@@ -28479,7 +28478,7 @@
           <w:szCs w:val="18"/>
         </w:rPr>
         <w:pict w14:anchorId="54094340">
-          <v:rect id="_x0000_i1105" style="width:0;height:1.5pt" o:hralign="center" o:hrstd="t" o:hr="t" fillcolor="#a0a0a0" stroked="f"/>
+          <v:rect id="_x0000_i1108" style="width:0;height:1.5pt" o:hralign="center" o:hrstd="t" o:hr="t" fillcolor="#a0a0a0" stroked="f"/>
         </w:pict>
       </w:r>
     </w:p>
@@ -28624,7 +28623,7 @@
           <w:szCs w:val="18"/>
         </w:rPr>
         <w:pict w14:anchorId="0265C878">
-          <v:rect id="_x0000_i1106" style="width:0;height:1.5pt" o:hralign="center" o:hrstd="t" o:hr="t" fillcolor="#a0a0a0" stroked="f"/>
+          <v:rect id="_x0000_i1109" style="width:0;height:1.5pt" o:hralign="center" o:hrstd="t" o:hr="t" fillcolor="#a0a0a0" stroked="f"/>
         </w:pict>
       </w:r>
     </w:p>
@@ -28971,7 +28970,7 @@
           <w:szCs w:val="18"/>
         </w:rPr>
         <w:pict w14:anchorId="15C84B62">
-          <v:rect id="_x0000_i1107" style="width:0;height:1.5pt" o:hralign="center" o:hrstd="t" o:hr="t" fillcolor="#a0a0a0" stroked="f"/>
+          <v:rect id="_x0000_i1110" style="width:0;height:1.5pt" o:hralign="center" o:hrstd="t" o:hr="t" fillcolor="#a0a0a0" stroked="f"/>
         </w:pict>
       </w:r>
     </w:p>
@@ -29067,7 +29066,6 @@
           <w:sz w:val="18"/>
           <w:szCs w:val="18"/>
         </w:rPr>
-        <w:lastRenderedPageBreak/>
         <w:t>Different formats:</w:t>
       </w:r>
     </w:p>
@@ -29104,6 +29102,7 @@
                 <w:sz w:val="18"/>
                 <w:szCs w:val="18"/>
               </w:rPr>
+              <w:lastRenderedPageBreak/>
               <w:t>Format</w:t>
             </w:r>
           </w:p>
@@ -29397,429 +29396,6 @@
           <w:szCs w:val="18"/>
         </w:rPr>
         <w:pict w14:anchorId="4000B363">
-          <v:rect id="_x0000_i1108" style="width:0;height:1.5pt" o:hralign="center" o:hrstd="t" o:hr="t" fillcolor="#a0a0a0" stroked="f"/>
-        </w:pict>
-      </w:r>
-    </w:p>
-    <w:p>
-      <w:pPr>
-        <w:rPr>
-          <w:b/>
-          <w:bCs/>
-          <w:sz w:val="18"/>
-          <w:szCs w:val="18"/>
-        </w:rPr>
-      </w:pPr>
-      <w:r>
-        <w:rPr>
-          <w:b/>
-          <w:bCs/>
-          <w:sz w:val="18"/>
-          <w:szCs w:val="18"/>
-        </w:rPr>
-        <w:t>Floating Point Literals</w:t>
-      </w:r>
-      <w:r>
-        <w:rPr>
-          <w:b/>
-          <w:bCs/>
-          <w:sz w:val="18"/>
-          <w:szCs w:val="18"/>
-        </w:rPr>
-        <w:t xml:space="preserve">: </w:t>
-      </w:r>
-      <w:r>
-        <w:rPr>
-          <w:sz w:val="18"/>
-          <w:szCs w:val="18"/>
-        </w:rPr>
-        <w:t xml:space="preserve">Represent </w:t>
-      </w:r>
-      <w:r>
-        <w:rPr>
-          <w:b/>
-          <w:bCs/>
-          <w:sz w:val="18"/>
-          <w:szCs w:val="18"/>
-        </w:rPr>
-        <w:t>decimal numbers</w:t>
-      </w:r>
-      <w:r>
-        <w:rPr>
-          <w:sz w:val="18"/>
-          <w:szCs w:val="18"/>
-        </w:rPr>
-        <w:t>.</w:t>
-      </w:r>
-    </w:p>
-    <w:p>
-      <w:pPr>
-        <w:rPr>
-          <w:sz w:val="18"/>
-          <w:szCs w:val="18"/>
-        </w:rPr>
-      </w:pPr>
-      <w:r>
-        <w:rPr>
-          <w:sz w:val="18"/>
-          <w:szCs w:val="18"/>
-        </w:rPr>
-        <w:t>Example:</w:t>
-      </w:r>
-    </w:p>
-    <w:p>
-      <w:pPr>
-        <w:rPr>
-          <w:sz w:val="18"/>
-          <w:szCs w:val="18"/>
-        </w:rPr>
-      </w:pPr>
-      <w:r>
-        <w:rPr>
-          <w:sz w:val="18"/>
-          <w:szCs w:val="18"/>
-        </w:rPr>
-        <w:t>float price = 10.5f;</w:t>
-      </w:r>
-    </w:p>
-    <w:p>
-      <w:pPr>
-        <w:rPr>
-          <w:sz w:val="18"/>
-          <w:szCs w:val="18"/>
-        </w:rPr>
-      </w:pPr>
-      <w:r>
-        <w:rPr>
-          <w:sz w:val="18"/>
-          <w:szCs w:val="18"/>
-        </w:rPr>
-        <w:t>double pi = 3.14159;</w:t>
-      </w:r>
-    </w:p>
-    <w:p>
-      <w:pPr>
-        <w:rPr>
-          <w:sz w:val="18"/>
-          <w:szCs w:val="18"/>
-        </w:rPr>
-      </w:pPr>
-      <w:r>
-        <w:rPr>
-          <w:sz w:val="18"/>
-          <w:szCs w:val="18"/>
-        </w:rPr>
-        <w:t>Important rule:</w:t>
-      </w:r>
-      <w:r>
-        <w:rPr>
-          <w:sz w:val="18"/>
-          <w:szCs w:val="18"/>
-        </w:rPr>
-        <w:t xml:space="preserve"> </w:t>
-      </w:r>
-      <w:r>
-        <w:rPr>
-          <w:sz w:val="18"/>
-          <w:szCs w:val="18"/>
-        </w:rPr>
-        <w:t>float must end with 'f'</w:t>
-      </w:r>
-    </w:p>
-    <w:p>
-      <w:pPr>
-        <w:rPr>
-          <w:sz w:val="18"/>
-          <w:szCs w:val="18"/>
-        </w:rPr>
-      </w:pPr>
-      <w:r>
-        <w:rPr>
-          <w:sz w:val="18"/>
-          <w:szCs w:val="18"/>
-        </w:rPr>
-        <w:t>Example:</w:t>
-      </w:r>
-      <w:r>
-        <w:rPr>
-          <w:sz w:val="18"/>
-          <w:szCs w:val="18"/>
-        </w:rPr>
-        <w:t xml:space="preserve"> </w:t>
-      </w:r>
-      <w:r>
-        <w:rPr>
-          <w:sz w:val="18"/>
-          <w:szCs w:val="18"/>
-        </w:rPr>
-        <w:t>float value = 5.5f;</w:t>
-      </w:r>
-    </w:p>
-    <w:p>
-      <w:pPr>
-        <w:rPr>
-          <w:sz w:val="18"/>
-          <w:szCs w:val="18"/>
-        </w:rPr>
-      </w:pPr>
-      <w:r>
-        <w:rPr>
-          <w:sz w:val="18"/>
-          <w:szCs w:val="18"/>
-        </w:rPr>
-        <w:pict w14:anchorId="75EEC410">
-          <v:rect id="_x0000_i1109" style="width:0;height:1.5pt" o:hralign="center" o:hrstd="t" o:hr="t" fillcolor="#a0a0a0" stroked="f"/>
-        </w:pict>
-      </w:r>
-    </w:p>
-    <w:p>
-      <w:pPr>
-        <w:rPr>
-          <w:b/>
-          <w:bCs/>
-          <w:sz w:val="18"/>
-          <w:szCs w:val="18"/>
-        </w:rPr>
-      </w:pPr>
-      <w:r>
-        <w:rPr>
-          <w:b/>
-          <w:bCs/>
-          <w:sz w:val="18"/>
-          <w:szCs w:val="18"/>
-        </w:rPr>
-        <w:t>Character Literals</w:t>
-      </w:r>
-      <w:r>
-        <w:rPr>
-          <w:b/>
-          <w:bCs/>
-          <w:sz w:val="18"/>
-          <w:szCs w:val="18"/>
-        </w:rPr>
-        <w:t xml:space="preserve">: </w:t>
-      </w:r>
-      <w:r>
-        <w:rPr>
-          <w:sz w:val="18"/>
-          <w:szCs w:val="18"/>
-        </w:rPr>
-        <w:t xml:space="preserve">Represent </w:t>
-      </w:r>
-      <w:r>
-        <w:rPr>
-          <w:b/>
-          <w:bCs/>
-          <w:sz w:val="18"/>
-          <w:szCs w:val="18"/>
-        </w:rPr>
-        <w:t>single characters</w:t>
-      </w:r>
-      <w:r>
-        <w:rPr>
-          <w:sz w:val="18"/>
-          <w:szCs w:val="18"/>
-        </w:rPr>
-        <w:t>.</w:t>
-      </w:r>
-    </w:p>
-    <w:p>
-      <w:pPr>
-        <w:rPr>
-          <w:sz w:val="18"/>
-          <w:szCs w:val="18"/>
-        </w:rPr>
-      </w:pPr>
-      <w:r>
-        <w:rPr>
-          <w:sz w:val="18"/>
-          <w:szCs w:val="18"/>
-        </w:rPr>
-        <w:t>Example:</w:t>
-      </w:r>
-      <w:r>
-        <w:rPr>
-          <w:sz w:val="18"/>
-          <w:szCs w:val="18"/>
-        </w:rPr>
-        <w:t xml:space="preserve"> </w:t>
-      </w:r>
-      <w:r>
-        <w:rPr>
-          <w:sz w:val="18"/>
-          <w:szCs w:val="18"/>
-        </w:rPr>
-        <w:t>char grade = 'A';</w:t>
-      </w:r>
-    </w:p>
-    <w:p>
-      <w:pPr>
-        <w:rPr>
-          <w:sz w:val="18"/>
-          <w:szCs w:val="18"/>
-        </w:rPr>
-      </w:pPr>
-      <w:r>
-        <w:rPr>
-          <w:sz w:val="18"/>
-          <w:szCs w:val="18"/>
-        </w:rPr>
-        <w:t>Unicode example:</w:t>
-      </w:r>
-      <w:r>
-        <w:rPr>
-          <w:sz w:val="18"/>
-          <w:szCs w:val="18"/>
-        </w:rPr>
-        <w:t xml:space="preserve"> </w:t>
-      </w:r>
-      <w:r>
-        <w:rPr>
-          <w:sz w:val="18"/>
-          <w:szCs w:val="18"/>
-        </w:rPr>
-        <w:t>char letter = '\u0041';</w:t>
-      </w:r>
-    </w:p>
-    <w:p>
-      <w:pPr>
-        <w:rPr>
-          <w:sz w:val="18"/>
-          <w:szCs w:val="18"/>
-        </w:rPr>
-      </w:pPr>
-      <w:r>
-        <w:rPr>
-          <w:sz w:val="18"/>
-          <w:szCs w:val="18"/>
-        </w:rPr>
-        <w:t>Output:</w:t>
-      </w:r>
-      <w:r>
-        <w:rPr>
-          <w:sz w:val="18"/>
-          <w:szCs w:val="18"/>
-        </w:rPr>
-        <w:t xml:space="preserve"> </w:t>
-      </w:r>
-      <w:r>
-        <w:rPr>
-          <w:sz w:val="18"/>
-          <w:szCs w:val="18"/>
-        </w:rPr>
-        <w:t>A</w:t>
-      </w:r>
-    </w:p>
-    <w:p>
-      <w:pPr>
-        <w:rPr>
-          <w:sz w:val="18"/>
-          <w:szCs w:val="18"/>
-        </w:rPr>
-      </w:pPr>
-      <w:r>
-        <w:rPr>
-          <w:sz w:val="18"/>
-          <w:szCs w:val="18"/>
-        </w:rPr>
-        <w:pict w14:anchorId="63E4979E">
-          <v:rect id="_x0000_i1110" style="width:0;height:1.5pt" o:hralign="center" o:hrstd="t" o:hr="t" fillcolor="#a0a0a0" stroked="f"/>
-        </w:pict>
-      </w:r>
-    </w:p>
-    <w:p>
-      <w:pPr>
-        <w:rPr>
-          <w:b/>
-          <w:bCs/>
-          <w:sz w:val="18"/>
-          <w:szCs w:val="18"/>
-        </w:rPr>
-      </w:pPr>
-      <w:r>
-        <w:rPr>
-          <w:b/>
-          <w:bCs/>
-          <w:sz w:val="18"/>
-          <w:szCs w:val="18"/>
-        </w:rPr>
-        <w:t>String Literals</w:t>
-      </w:r>
-      <w:r>
-        <w:rPr>
-          <w:b/>
-          <w:bCs/>
-          <w:sz w:val="18"/>
-          <w:szCs w:val="18"/>
-        </w:rPr>
-        <w:t xml:space="preserve"> : </w:t>
-      </w:r>
-      <w:r>
-        <w:rPr>
-          <w:sz w:val="18"/>
-          <w:szCs w:val="18"/>
-        </w:rPr>
-        <w:t xml:space="preserve">A </w:t>
-      </w:r>
-      <w:r>
-        <w:rPr>
-          <w:b/>
-          <w:bCs/>
-          <w:sz w:val="18"/>
-          <w:szCs w:val="18"/>
-        </w:rPr>
-        <w:t>sequence of characters enclosed in double quotes</w:t>
-      </w:r>
-      <w:r>
-        <w:rPr>
-          <w:sz w:val="18"/>
-          <w:szCs w:val="18"/>
-        </w:rPr>
-        <w:t>.</w:t>
-      </w:r>
-    </w:p>
-    <w:p>
-      <w:pPr>
-        <w:rPr>
-          <w:sz w:val="18"/>
-          <w:szCs w:val="18"/>
-        </w:rPr>
-      </w:pPr>
-      <w:r>
-        <w:rPr>
-          <w:sz w:val="18"/>
-          <w:szCs w:val="18"/>
-        </w:rPr>
-        <w:t>Example:</w:t>
-      </w:r>
-      <w:r>
-        <w:rPr>
-          <w:sz w:val="18"/>
-          <w:szCs w:val="18"/>
-        </w:rPr>
-        <w:t xml:space="preserve"> </w:t>
-      </w:r>
-      <w:r>
-        <w:rPr>
-          <w:sz w:val="18"/>
-          <w:szCs w:val="18"/>
-        </w:rPr>
-        <w:t>String name = "Java Programming";</w:t>
-      </w:r>
-    </w:p>
-    <w:p>
-      <w:pPr>
-        <w:rPr>
-          <w:sz w:val="18"/>
-          <w:szCs w:val="18"/>
-        </w:rPr>
-      </w:pPr>
-      <w:r>
-        <w:rPr>
-          <w:sz w:val="18"/>
-          <w:szCs w:val="18"/>
-        </w:rPr>
-        <w:pict w14:anchorId="53996156">
           <v:rect id="_x0000_i1111" style="width:0;height:1.5pt" o:hralign="center" o:hrstd="t" o:hr="t" fillcolor="#a0a0a0" stroked="f"/>
         </w:pict>
       </w:r>
@@ -29840,22 +29416,39 @@
           <w:sz w:val="18"/>
           <w:szCs w:val="18"/>
         </w:rPr>
-        <w:t>Boolean Literals</w:t>
-      </w:r>
-    </w:p>
-    <w:p>
-      <w:pPr>
-        <w:rPr>
-          <w:sz w:val="18"/>
-          <w:szCs w:val="18"/>
-        </w:rPr>
-      </w:pPr>
-      <w:r>
-        <w:rPr>
-          <w:sz w:val="18"/>
-          <w:szCs w:val="18"/>
-        </w:rPr>
-        <w:t>Represent logical values.</w:t>
+        <w:t>Floating Point Literals</w:t>
+      </w:r>
+      <w:r>
+        <w:rPr>
+          <w:b/>
+          <w:bCs/>
+          <w:sz w:val="18"/>
+          <w:szCs w:val="18"/>
+        </w:rPr>
+        <w:t xml:space="preserve">: </w:t>
+      </w:r>
+      <w:r>
+        <w:rPr>
+          <w:sz w:val="18"/>
+          <w:szCs w:val="18"/>
+        </w:rPr>
+        <w:t xml:space="preserve">Represent </w:t>
+      </w:r>
+      <w:r>
+        <w:rPr>
+          <w:b/>
+          <w:bCs/>
+          <w:sz w:val="18"/>
+          <w:szCs w:val="18"/>
+        </w:rPr>
+        <w:t>decimal numbers</w:t>
+      </w:r>
+      <w:r>
+        <w:rPr>
+          <w:sz w:val="18"/>
+          <w:szCs w:val="18"/>
+        </w:rPr>
+        <w:t>.</w:t>
       </w:r>
     </w:p>
     <w:p>
@@ -29872,8 +29465,59 @@
         </w:rPr>
         <w:t>Example:</w:t>
       </w:r>
-      <w:r>
-        <w:rPr>
+    </w:p>
+    <w:p>
+      <w:pPr>
+        <w:rPr>
+          <w:sz w:val="18"/>
+          <w:szCs w:val="18"/>
+        </w:rPr>
+      </w:pPr>
+      <w:r>
+        <w:rPr>
+          <w:sz w:val="18"/>
+          <w:szCs w:val="18"/>
+        </w:rPr>
+        <w:t>float price = 10.5f;</w:t>
+      </w:r>
+    </w:p>
+    <w:p>
+      <w:pPr>
+        <w:rPr>
+          <w:sz w:val="18"/>
+          <w:szCs w:val="18"/>
+        </w:rPr>
+      </w:pPr>
+      <w:r>
+        <w:rPr>
+          <w:sz w:val="18"/>
+          <w:szCs w:val="18"/>
+        </w:rPr>
+        <w:t>double pi = 3.14159;</w:t>
+      </w:r>
+    </w:p>
+    <w:p>
+      <w:pPr>
+        <w:rPr>
+          <w:b/>
+          <w:bCs/>
+          <w:sz w:val="18"/>
+          <w:szCs w:val="18"/>
+        </w:rPr>
+      </w:pPr>
+      <w:r>
+        <w:rPr>
+          <w:b/>
+          <w:bCs/>
+          <w:sz w:val="18"/>
+          <w:szCs w:val="18"/>
+        </w:rPr>
+        <w:t>Important rule:</w:t>
+      </w:r>
+      <w:r>
+        <w:rPr>
+          <w:b/>
+          <w:bCs/>
           <w:sz w:val="18"/>
           <w:szCs w:val="18"/>
         </w:rPr>
@@ -29881,25 +29525,56 @@
       </w:r>
       <w:r>
         <w:rPr>
-          <w:sz w:val="18"/>
-          <w:szCs w:val="18"/>
-        </w:rPr>
-        <w:t>boolean isJavaFun = true;</w:t>
-      </w:r>
-    </w:p>
-    <w:p>
-      <w:pPr>
-        <w:rPr>
-          <w:sz w:val="18"/>
-          <w:szCs w:val="18"/>
-        </w:rPr>
-      </w:pPr>
-      <w:r>
-        <w:rPr>
-          <w:sz w:val="18"/>
-          <w:szCs w:val="18"/>
-        </w:rPr>
-        <w:pict w14:anchorId="3E381162">
+          <w:b/>
+          <w:bCs/>
+          <w:sz w:val="18"/>
+          <w:szCs w:val="18"/>
+        </w:rPr>
+        <w:t>float must end with 'f'</w:t>
+      </w:r>
+    </w:p>
+    <w:p>
+      <w:pPr>
+        <w:rPr>
+          <w:sz w:val="18"/>
+          <w:szCs w:val="18"/>
+        </w:rPr>
+      </w:pPr>
+      <w:r>
+        <w:rPr>
+          <w:sz w:val="18"/>
+          <w:szCs w:val="18"/>
+        </w:rPr>
+        <w:t>Example:</w:t>
+      </w:r>
+      <w:r>
+        <w:rPr>
+          <w:sz w:val="18"/>
+          <w:szCs w:val="18"/>
+        </w:rPr>
+        <w:t xml:space="preserve"> </w:t>
+      </w:r>
+      <w:r>
+        <w:rPr>
+          <w:sz w:val="18"/>
+          <w:szCs w:val="18"/>
+        </w:rPr>
+        <w:t>float value = 5.5f;</w:t>
+      </w:r>
+    </w:p>
+    <w:p>
+      <w:pPr>
+        <w:rPr>
+          <w:sz w:val="18"/>
+          <w:szCs w:val="18"/>
+        </w:rPr>
+      </w:pPr>
+      <w:r>
+        <w:rPr>
+          <w:sz w:val="18"/>
+          <w:szCs w:val="18"/>
+        </w:rPr>
+        <w:pict w14:anchorId="75EEC410">
           <v:rect id="_x0000_i1112" style="width:0;height:1.5pt" o:hralign="center" o:hrstd="t" o:hr="t" fillcolor="#a0a0a0" stroked="f"/>
         </w:pict>
       </w:r>
@@ -29920,241 +29595,141 @@
           <w:sz w:val="18"/>
           <w:szCs w:val="18"/>
         </w:rPr>
-        <w:t>Example Program Using Literals</w:t>
-      </w:r>
-    </w:p>
-    <w:p>
-      <w:pPr>
-        <w:rPr>
-          <w:sz w:val="18"/>
-          <w:szCs w:val="18"/>
-        </w:rPr>
-      </w:pPr>
-      <w:r>
-        <w:rPr>
-          <w:sz w:val="18"/>
-          <w:szCs w:val="18"/>
-        </w:rPr>
-        <w:t>class LiteralExample {</w:t>
-      </w:r>
-    </w:p>
-    <w:p>
-      <w:pPr>
-        <w:rPr>
-          <w:sz w:val="18"/>
-          <w:szCs w:val="18"/>
-        </w:rPr>
-      </w:pPr>
-      <w:r>
-        <w:rPr>
-          <w:sz w:val="18"/>
-          <w:szCs w:val="18"/>
-        </w:rPr>
-        <w:t>public static void main(String[] args) {</w:t>
-      </w:r>
-    </w:p>
-    <w:p>
-      <w:pPr>
-        <w:rPr>
-          <w:sz w:val="18"/>
-          <w:szCs w:val="18"/>
-        </w:rPr>
-      </w:pPr>
-      <w:r>
-        <w:rPr>
-          <w:sz w:val="18"/>
-          <w:szCs w:val="18"/>
-        </w:rPr>
-        <w:t xml:space="preserve">        int number = 100;</w:t>
-      </w:r>
-    </w:p>
-    <w:p>
-      <w:pPr>
-        <w:rPr>
-          <w:sz w:val="18"/>
-          <w:szCs w:val="18"/>
-        </w:rPr>
-      </w:pPr>
-      <w:r>
-        <w:rPr>
-          <w:sz w:val="18"/>
-          <w:szCs w:val="18"/>
-        </w:rPr>
-        <w:t xml:space="preserve">        float price = 12.5f;</w:t>
-      </w:r>
-    </w:p>
-    <w:p>
-      <w:pPr>
-        <w:rPr>
-          <w:sz w:val="18"/>
-          <w:szCs w:val="18"/>
-        </w:rPr>
-      </w:pPr>
-      <w:r>
-        <w:rPr>
-          <w:sz w:val="18"/>
-          <w:szCs w:val="18"/>
-        </w:rPr>
-        <w:t xml:space="preserve">        char grade = 'A';</w:t>
-      </w:r>
-    </w:p>
-    <w:p>
-      <w:pPr>
-        <w:rPr>
-          <w:sz w:val="18"/>
-          <w:szCs w:val="18"/>
-        </w:rPr>
-      </w:pPr>
-      <w:r>
-        <w:rPr>
-          <w:sz w:val="18"/>
-          <w:szCs w:val="18"/>
-        </w:rPr>
-        <w:t xml:space="preserve">        String message = "Java";</w:t>
-      </w:r>
-    </w:p>
-    <w:p>
-      <w:pPr>
-        <w:rPr>
-          <w:sz w:val="18"/>
-          <w:szCs w:val="18"/>
-        </w:rPr>
-      </w:pPr>
-      <w:r>
-        <w:rPr>
-          <w:sz w:val="18"/>
-          <w:szCs w:val="18"/>
-        </w:rPr>
-        <w:lastRenderedPageBreak/>
-        <w:t xml:space="preserve">        boolean status = true;</w:t>
-      </w:r>
-    </w:p>
-    <w:p>
-      <w:pPr>
-        <w:rPr>
-          <w:sz w:val="18"/>
-          <w:szCs w:val="18"/>
-        </w:rPr>
-      </w:pPr>
-    </w:p>
-    <w:p>
-      <w:pPr>
-        <w:rPr>
-          <w:sz w:val="18"/>
-          <w:szCs w:val="18"/>
-        </w:rPr>
-      </w:pPr>
-      <w:r>
-        <w:rPr>
-          <w:sz w:val="18"/>
-          <w:szCs w:val="18"/>
-        </w:rPr>
-        <w:t xml:space="preserve">        System.out.println(number);</w:t>
-      </w:r>
-    </w:p>
-    <w:p>
-      <w:pPr>
-        <w:rPr>
-          <w:sz w:val="18"/>
-          <w:szCs w:val="18"/>
-        </w:rPr>
-      </w:pPr>
-      <w:r>
-        <w:rPr>
-          <w:sz w:val="18"/>
-          <w:szCs w:val="18"/>
-        </w:rPr>
-        <w:t xml:space="preserve">        System.out.println(price);</w:t>
-      </w:r>
-    </w:p>
-    <w:p>
-      <w:pPr>
-        <w:rPr>
-          <w:sz w:val="18"/>
-          <w:szCs w:val="18"/>
-        </w:rPr>
-      </w:pPr>
-      <w:r>
-        <w:rPr>
-          <w:sz w:val="18"/>
-          <w:szCs w:val="18"/>
-        </w:rPr>
-        <w:t xml:space="preserve">        System.out.println(grade);</w:t>
-      </w:r>
-    </w:p>
-    <w:p>
-      <w:pPr>
-        <w:rPr>
-          <w:sz w:val="18"/>
-          <w:szCs w:val="18"/>
-        </w:rPr>
-      </w:pPr>
-      <w:r>
-        <w:rPr>
-          <w:sz w:val="18"/>
-          <w:szCs w:val="18"/>
-        </w:rPr>
-        <w:t xml:space="preserve">        System.out.println(message);</w:t>
-      </w:r>
-    </w:p>
-    <w:p>
-      <w:pPr>
-        <w:rPr>
-          <w:sz w:val="18"/>
-          <w:szCs w:val="18"/>
-        </w:rPr>
-      </w:pPr>
-      <w:r>
-        <w:rPr>
-          <w:sz w:val="18"/>
-          <w:szCs w:val="18"/>
-        </w:rPr>
-        <w:t xml:space="preserve">        System.out.println(status);</w:t>
-      </w:r>
-    </w:p>
-    <w:p>
-      <w:pPr>
-        <w:rPr>
-          <w:sz w:val="18"/>
-          <w:szCs w:val="18"/>
-        </w:rPr>
-      </w:pPr>
-      <w:r>
-        <w:rPr>
-          <w:sz w:val="18"/>
-          <w:szCs w:val="18"/>
-        </w:rPr>
-        <w:t xml:space="preserve">    }</w:t>
-      </w:r>
-    </w:p>
-    <w:p>
-      <w:pPr>
-        <w:rPr>
-          <w:sz w:val="18"/>
-          <w:szCs w:val="18"/>
-        </w:rPr>
-      </w:pPr>
-      <w:r>
-        <w:rPr>
-          <w:sz w:val="18"/>
-          <w:szCs w:val="18"/>
-        </w:rPr>
-        <w:t>}</w:t>
-      </w:r>
-    </w:p>
-    <w:p>
-      <w:pPr>
-        <w:rPr>
-          <w:sz w:val="18"/>
-          <w:szCs w:val="18"/>
-        </w:rPr>
-      </w:pPr>
-      <w:r>
-        <w:rPr>
-          <w:sz w:val="18"/>
-          <w:szCs w:val="18"/>
-        </w:rPr>
-        <w:pict w14:anchorId="07FFC116">
+        <w:t>Character Literals</w:t>
+      </w:r>
+      <w:r>
+        <w:rPr>
+          <w:b/>
+          <w:bCs/>
+          <w:sz w:val="18"/>
+          <w:szCs w:val="18"/>
+        </w:rPr>
+        <w:t xml:space="preserve">: </w:t>
+      </w:r>
+      <w:r>
+        <w:rPr>
+          <w:sz w:val="18"/>
+          <w:szCs w:val="18"/>
+        </w:rPr>
+        <w:t xml:space="preserve">Represent </w:t>
+      </w:r>
+      <w:r>
+        <w:rPr>
+          <w:b/>
+          <w:bCs/>
+          <w:sz w:val="18"/>
+          <w:szCs w:val="18"/>
+        </w:rPr>
+        <w:t>single characters</w:t>
+      </w:r>
+      <w:r>
+        <w:rPr>
+          <w:sz w:val="18"/>
+          <w:szCs w:val="18"/>
+        </w:rPr>
+        <w:t>.</w:t>
+      </w:r>
+    </w:p>
+    <w:p>
+      <w:pPr>
+        <w:rPr>
+          <w:sz w:val="18"/>
+          <w:szCs w:val="18"/>
+        </w:rPr>
+      </w:pPr>
+      <w:r>
+        <w:rPr>
+          <w:sz w:val="18"/>
+          <w:szCs w:val="18"/>
+        </w:rPr>
+        <w:t>Example:</w:t>
+      </w:r>
+      <w:r>
+        <w:rPr>
+          <w:sz w:val="18"/>
+          <w:szCs w:val="18"/>
+        </w:rPr>
+        <w:t xml:space="preserve"> </w:t>
+      </w:r>
+      <w:r>
+        <w:rPr>
+          <w:sz w:val="18"/>
+          <w:szCs w:val="18"/>
+        </w:rPr>
+        <w:t>char grade = 'A';</w:t>
+      </w:r>
+    </w:p>
+    <w:p>
+      <w:pPr>
+        <w:rPr>
+          <w:sz w:val="18"/>
+          <w:szCs w:val="18"/>
+        </w:rPr>
+      </w:pPr>
+      <w:r>
+        <w:rPr>
+          <w:sz w:val="18"/>
+          <w:szCs w:val="18"/>
+        </w:rPr>
+        <w:t>Unicode example:</w:t>
+      </w:r>
+      <w:r>
+        <w:rPr>
+          <w:sz w:val="18"/>
+          <w:szCs w:val="18"/>
+        </w:rPr>
+        <w:t xml:space="preserve"> </w:t>
+      </w:r>
+      <w:r>
+        <w:rPr>
+          <w:sz w:val="18"/>
+          <w:szCs w:val="18"/>
+        </w:rPr>
+        <w:t>char letter = '\u0041';</w:t>
+      </w:r>
+    </w:p>
+    <w:p>
+      <w:pPr>
+        <w:rPr>
+          <w:sz w:val="18"/>
+          <w:szCs w:val="18"/>
+        </w:rPr>
+      </w:pPr>
+      <w:r>
+        <w:rPr>
+          <w:sz w:val="18"/>
+          <w:szCs w:val="18"/>
+        </w:rPr>
+        <w:t>Output:</w:t>
+      </w:r>
+      <w:r>
+        <w:rPr>
+          <w:sz w:val="18"/>
+          <w:szCs w:val="18"/>
+        </w:rPr>
+        <w:t xml:space="preserve"> </w:t>
+      </w:r>
+      <w:r>
+        <w:rPr>
+          <w:sz w:val="18"/>
+          <w:szCs w:val="18"/>
+        </w:rPr>
+        <w:t>A</w:t>
+      </w:r>
+    </w:p>
+    <w:p>
+      <w:pPr>
+        <w:rPr>
+          <w:sz w:val="18"/>
+          <w:szCs w:val="18"/>
+        </w:rPr>
+      </w:pPr>
+      <w:r>
+        <w:rPr>
+          <w:sz w:val="18"/>
+          <w:szCs w:val="18"/>
+        </w:rPr>
+        <w:pict w14:anchorId="63E4979E">
           <v:rect id="_x0000_i1113" style="width:0;height:1.5pt" o:hralign="center" o:hrstd="t" o:hr="t" fillcolor="#a0a0a0" stroked="f"/>
         </w:pict>
       </w:r>
@@ -30175,6 +29750,437 @@
           <w:sz w:val="18"/>
           <w:szCs w:val="18"/>
         </w:rPr>
+        <w:t>String Literals</w:t>
+      </w:r>
+      <w:r>
+        <w:rPr>
+          <w:b/>
+          <w:bCs/>
+          <w:sz w:val="18"/>
+          <w:szCs w:val="18"/>
+        </w:rPr>
+        <w:t xml:space="preserve"> : </w:t>
+      </w:r>
+      <w:r>
+        <w:rPr>
+          <w:sz w:val="18"/>
+          <w:szCs w:val="18"/>
+        </w:rPr>
+        <w:t xml:space="preserve">A </w:t>
+      </w:r>
+      <w:r>
+        <w:rPr>
+          <w:b/>
+          <w:bCs/>
+          <w:sz w:val="18"/>
+          <w:szCs w:val="18"/>
+        </w:rPr>
+        <w:t>sequence of characters enclosed in double quotes</w:t>
+      </w:r>
+      <w:r>
+        <w:rPr>
+          <w:sz w:val="18"/>
+          <w:szCs w:val="18"/>
+        </w:rPr>
+        <w:t>.</w:t>
+      </w:r>
+    </w:p>
+    <w:p>
+      <w:pPr>
+        <w:rPr>
+          <w:sz w:val="18"/>
+          <w:szCs w:val="18"/>
+        </w:rPr>
+      </w:pPr>
+      <w:r>
+        <w:rPr>
+          <w:sz w:val="18"/>
+          <w:szCs w:val="18"/>
+        </w:rPr>
+        <w:t>Example:</w:t>
+      </w:r>
+      <w:r>
+        <w:rPr>
+          <w:sz w:val="18"/>
+          <w:szCs w:val="18"/>
+        </w:rPr>
+        <w:t xml:space="preserve"> </w:t>
+      </w:r>
+      <w:r>
+        <w:rPr>
+          <w:sz w:val="18"/>
+          <w:szCs w:val="18"/>
+        </w:rPr>
+        <w:t>String name = "Java Programming";</w:t>
+      </w:r>
+    </w:p>
+    <w:p>
+      <w:pPr>
+        <w:rPr>
+          <w:sz w:val="18"/>
+          <w:szCs w:val="18"/>
+        </w:rPr>
+      </w:pPr>
+      <w:r>
+        <w:rPr>
+          <w:sz w:val="18"/>
+          <w:szCs w:val="18"/>
+        </w:rPr>
+        <w:pict w14:anchorId="53996156">
+          <v:rect id="_x0000_i1114" style="width:0;height:1.5pt" o:hralign="center" o:hrstd="t" o:hr="t" fillcolor="#a0a0a0" stroked="f"/>
+        </w:pict>
+      </w:r>
+    </w:p>
+    <w:p>
+      <w:pPr>
+        <w:rPr>
+          <w:b/>
+          <w:bCs/>
+          <w:sz w:val="18"/>
+          <w:szCs w:val="18"/>
+        </w:rPr>
+      </w:pPr>
+      <w:r>
+        <w:rPr>
+          <w:b/>
+          <w:bCs/>
+          <w:sz w:val="18"/>
+          <w:szCs w:val="18"/>
+        </w:rPr>
+        <w:t>Boolean Literals</w:t>
+      </w:r>
+    </w:p>
+    <w:p>
+      <w:pPr>
+        <w:rPr>
+          <w:sz w:val="18"/>
+          <w:szCs w:val="18"/>
+        </w:rPr>
+      </w:pPr>
+      <w:r>
+        <w:rPr>
+          <w:sz w:val="18"/>
+          <w:szCs w:val="18"/>
+        </w:rPr>
+        <w:t>Represent logical values.</w:t>
+      </w:r>
+    </w:p>
+    <w:p>
+      <w:pPr>
+        <w:rPr>
+          <w:sz w:val="18"/>
+          <w:szCs w:val="18"/>
+        </w:rPr>
+      </w:pPr>
+      <w:r>
+        <w:rPr>
+          <w:sz w:val="18"/>
+          <w:szCs w:val="18"/>
+        </w:rPr>
+        <w:t>Example:</w:t>
+      </w:r>
+      <w:r>
+        <w:rPr>
+          <w:sz w:val="18"/>
+          <w:szCs w:val="18"/>
+        </w:rPr>
+        <w:t xml:space="preserve"> </w:t>
+      </w:r>
+      <w:r>
+        <w:rPr>
+          <w:sz w:val="18"/>
+          <w:szCs w:val="18"/>
+        </w:rPr>
+        <w:t>boolean isJavaFun = true;</w:t>
+      </w:r>
+    </w:p>
+    <w:p>
+      <w:pPr>
+        <w:rPr>
+          <w:sz w:val="18"/>
+          <w:szCs w:val="18"/>
+        </w:rPr>
+      </w:pPr>
+      <w:r>
+        <w:rPr>
+          <w:sz w:val="18"/>
+          <w:szCs w:val="18"/>
+        </w:rPr>
+        <w:pict w14:anchorId="3E381162">
+          <v:rect id="_x0000_i1115" style="width:0;height:1.5pt" o:hralign="center" o:hrstd="t" o:hr="t" fillcolor="#a0a0a0" stroked="f"/>
+        </w:pict>
+      </w:r>
+    </w:p>
+    <w:p>
+      <w:pPr>
+        <w:rPr>
+          <w:b/>
+          <w:bCs/>
+          <w:sz w:val="18"/>
+          <w:szCs w:val="18"/>
+        </w:rPr>
+      </w:pPr>
+      <w:r>
+        <w:rPr>
+          <w:b/>
+          <w:bCs/>
+          <w:sz w:val="18"/>
+          <w:szCs w:val="18"/>
+        </w:rPr>
+        <w:t>Example Program Using Literals</w:t>
+      </w:r>
+    </w:p>
+    <w:p>
+      <w:pPr>
+        <w:rPr>
+          <w:sz w:val="18"/>
+          <w:szCs w:val="18"/>
+        </w:rPr>
+      </w:pPr>
+      <w:r>
+        <w:rPr>
+          <w:sz w:val="18"/>
+          <w:szCs w:val="18"/>
+        </w:rPr>
+        <w:t>class LiteralExample {</w:t>
+      </w:r>
+    </w:p>
+    <w:p>
+      <w:pPr>
+        <w:rPr>
+          <w:sz w:val="18"/>
+          <w:szCs w:val="18"/>
+        </w:rPr>
+      </w:pPr>
+      <w:r>
+        <w:rPr>
+          <w:sz w:val="18"/>
+          <w:szCs w:val="18"/>
+        </w:rPr>
+        <w:t>public static void main(String[] args) {</w:t>
+      </w:r>
+    </w:p>
+    <w:p>
+      <w:pPr>
+        <w:rPr>
+          <w:sz w:val="18"/>
+          <w:szCs w:val="18"/>
+        </w:rPr>
+      </w:pPr>
+      <w:r>
+        <w:rPr>
+          <w:sz w:val="18"/>
+          <w:szCs w:val="18"/>
+        </w:rPr>
+        <w:t xml:space="preserve">        int number = 100;</w:t>
+      </w:r>
+    </w:p>
+    <w:p>
+      <w:pPr>
+        <w:rPr>
+          <w:sz w:val="18"/>
+          <w:szCs w:val="18"/>
+        </w:rPr>
+      </w:pPr>
+      <w:r>
+        <w:rPr>
+          <w:sz w:val="18"/>
+          <w:szCs w:val="18"/>
+        </w:rPr>
+        <w:t xml:space="preserve">        float price = 12.5f;</w:t>
+      </w:r>
+    </w:p>
+    <w:p>
+      <w:pPr>
+        <w:rPr>
+          <w:sz w:val="18"/>
+          <w:szCs w:val="18"/>
+        </w:rPr>
+      </w:pPr>
+      <w:r>
+        <w:rPr>
+          <w:sz w:val="18"/>
+          <w:szCs w:val="18"/>
+        </w:rPr>
+        <w:t xml:space="preserve">        char grade = 'A';</w:t>
+      </w:r>
+    </w:p>
+    <w:p>
+      <w:pPr>
+        <w:rPr>
+          <w:sz w:val="18"/>
+          <w:szCs w:val="18"/>
+        </w:rPr>
+      </w:pPr>
+      <w:r>
+        <w:rPr>
+          <w:sz w:val="18"/>
+          <w:szCs w:val="18"/>
+        </w:rPr>
+        <w:t xml:space="preserve">        String message = "Java";</w:t>
+      </w:r>
+    </w:p>
+    <w:p>
+      <w:pPr>
+        <w:rPr>
+          <w:sz w:val="18"/>
+          <w:szCs w:val="18"/>
+        </w:rPr>
+      </w:pPr>
+      <w:r>
+        <w:rPr>
+          <w:sz w:val="18"/>
+          <w:szCs w:val="18"/>
+        </w:rPr>
+        <w:t xml:space="preserve">        boolean status = true;</w:t>
+      </w:r>
+    </w:p>
+    <w:p>
+      <w:pPr>
+        <w:rPr>
+          <w:sz w:val="18"/>
+          <w:szCs w:val="18"/>
+        </w:rPr>
+      </w:pPr>
+    </w:p>
+    <w:p>
+      <w:pPr>
+        <w:rPr>
+          <w:sz w:val="18"/>
+          <w:szCs w:val="18"/>
+        </w:rPr>
+      </w:pPr>
+      <w:r>
+        <w:rPr>
+          <w:sz w:val="18"/>
+          <w:szCs w:val="18"/>
+        </w:rPr>
+        <w:t xml:space="preserve">        System.out.println(number);</w:t>
+      </w:r>
+    </w:p>
+    <w:p>
+      <w:pPr>
+        <w:rPr>
+          <w:sz w:val="18"/>
+          <w:szCs w:val="18"/>
+        </w:rPr>
+      </w:pPr>
+      <w:r>
+        <w:rPr>
+          <w:sz w:val="18"/>
+          <w:szCs w:val="18"/>
+        </w:rPr>
+        <w:t xml:space="preserve">        System.out.println(price);</w:t>
+      </w:r>
+    </w:p>
+    <w:p>
+      <w:pPr>
+        <w:rPr>
+          <w:sz w:val="18"/>
+          <w:szCs w:val="18"/>
+        </w:rPr>
+      </w:pPr>
+      <w:r>
+        <w:rPr>
+          <w:sz w:val="18"/>
+          <w:szCs w:val="18"/>
+        </w:rPr>
+        <w:t xml:space="preserve">        System.out.println(grade);</w:t>
+      </w:r>
+    </w:p>
+    <w:p>
+      <w:pPr>
+        <w:rPr>
+          <w:sz w:val="18"/>
+          <w:szCs w:val="18"/>
+        </w:rPr>
+      </w:pPr>
+      <w:r>
+        <w:rPr>
+          <w:sz w:val="18"/>
+          <w:szCs w:val="18"/>
+        </w:rPr>
+        <w:t xml:space="preserve">        System.out.println(message);</w:t>
+      </w:r>
+    </w:p>
+    <w:p>
+      <w:pPr>
+        <w:rPr>
+          <w:sz w:val="18"/>
+          <w:szCs w:val="18"/>
+        </w:rPr>
+      </w:pPr>
+      <w:r>
+        <w:rPr>
+          <w:sz w:val="18"/>
+          <w:szCs w:val="18"/>
+        </w:rPr>
+        <w:t xml:space="preserve">        System.out.println(status);</w:t>
+      </w:r>
+    </w:p>
+    <w:p>
+      <w:pPr>
+        <w:rPr>
+          <w:sz w:val="18"/>
+          <w:szCs w:val="18"/>
+        </w:rPr>
+      </w:pPr>
+      <w:r>
+        <w:rPr>
+          <w:sz w:val="18"/>
+          <w:szCs w:val="18"/>
+        </w:rPr>
+        <w:t xml:space="preserve">    }</w:t>
+      </w:r>
+    </w:p>
+    <w:p>
+      <w:pPr>
+        <w:rPr>
+          <w:sz w:val="18"/>
+          <w:szCs w:val="18"/>
+        </w:rPr>
+      </w:pPr>
+      <w:r>
+        <w:rPr>
+          <w:sz w:val="18"/>
+          <w:szCs w:val="18"/>
+        </w:rPr>
+        <w:t>}</w:t>
+      </w:r>
+    </w:p>
+    <w:p>
+      <w:pPr>
+        <w:rPr>
+          <w:sz w:val="18"/>
+          <w:szCs w:val="18"/>
+        </w:rPr>
+      </w:pPr>
+      <w:r>
+        <w:rPr>
+          <w:sz w:val="18"/>
+          <w:szCs w:val="18"/>
+        </w:rPr>
+        <w:pict w14:anchorId="07FFC116">
+          <v:rect id="_x0000_i1116" style="width:0;height:1.5pt" o:hralign="center" o:hrstd="t" o:hr="t" fillcolor="#a0a0a0" stroked="f"/>
+        </w:pict>
+      </w:r>
+    </w:p>
+    <w:p>
+      <w:pPr>
+        <w:rPr>
+          <w:b/>
+          <w:bCs/>
+          <w:sz w:val="18"/>
+          <w:szCs w:val="18"/>
+        </w:rPr>
+      </w:pPr>
+      <w:r>
+        <w:rPr>
+          <w:b/>
+          <w:bCs/>
+          <w:sz w:val="18"/>
+          <w:szCs w:val="18"/>
+        </w:rPr>
         <w:t>8. Operators</w:t>
       </w:r>
     </w:p>
@@ -30287,7 +30293,7 @@
           <w:szCs w:val="18"/>
         </w:rPr>
         <w:pict w14:anchorId="799F0C5B">
-          <v:rect id="_x0000_i1114" style="width:0;height:1.5pt" o:hralign="center" o:hrstd="t" o:hr="t" fillcolor="#a0a0a0" stroked="f"/>
+          <v:rect id="_x0000_i1117" style="width:0;height:1.5pt" o:hralign="center" o:hrstd="t" o:hr="t" fillcolor="#a0a0a0" stroked="f"/>
         </w:pict>
       </w:r>
     </w:p>
@@ -30318,7 +30324,7 @@
       </w:tblPr>
       <w:tblGrid>
         <w:gridCol w:w="1291"/>
-        <w:gridCol w:w="1285"/>
+        <w:gridCol w:w="1510"/>
       </w:tblGrid>
       <w:tr>
         <w:trPr>
@@ -30417,7 +30423,63 @@
                 <w:sz w:val="18"/>
                 <w:szCs w:val="18"/>
               </w:rPr>
-              <w:t>+ - * / %</w:t>
+              <w:t>+</w:t>
+            </w:r>
+            <w:r>
+              <w:rPr>
+                <w:sz w:val="18"/>
+                <w:szCs w:val="18"/>
+              </w:rPr>
+              <w:t>,</w:t>
+            </w:r>
+            <w:r>
+              <w:rPr>
+                <w:sz w:val="18"/>
+                <w:szCs w:val="18"/>
+              </w:rPr>
+              <w:t xml:space="preserve"> -</w:t>
+            </w:r>
+            <w:r>
+              <w:rPr>
+                <w:sz w:val="18"/>
+                <w:szCs w:val="18"/>
+              </w:rPr>
+              <w:t>,</w:t>
+            </w:r>
+            <w:r>
+              <w:rPr>
+                <w:sz w:val="18"/>
+                <w:szCs w:val="18"/>
+              </w:rPr>
+              <w:t xml:space="preserve"> *</w:t>
+            </w:r>
+            <w:r>
+              <w:rPr>
+                <w:sz w:val="18"/>
+                <w:szCs w:val="18"/>
+              </w:rPr>
+              <w:t>,</w:t>
+            </w:r>
+            <w:r>
+              <w:rPr>
+                <w:sz w:val="18"/>
+                <w:szCs w:val="18"/>
+              </w:rPr>
+              <w:t xml:space="preserve"> /</w:t>
+            </w:r>
+            <w:r>
+              <w:rPr>
+                <w:sz w:val="18"/>
+                <w:szCs w:val="18"/>
+              </w:rPr>
+              <w:t>,</w:t>
+            </w:r>
+            <w:r>
+              <w:rPr>
+                <w:sz w:val="18"/>
+                <w:szCs w:val="18"/>
+              </w:rPr>
+              <w:t xml:space="preserve"> %</w:t>
             </w:r>
           </w:p>
         </w:tc>
@@ -30465,7 +30527,77 @@
                 <w:sz w:val="18"/>
                 <w:szCs w:val="18"/>
               </w:rPr>
-              <w:t>&gt; &lt; &gt;= &lt;= == !=</w:t>
+              <w:t>&gt;</w:t>
+            </w:r>
+            <w:r>
+              <w:rPr>
+                <w:sz w:val="18"/>
+                <w:szCs w:val="18"/>
+              </w:rPr>
+              <w:t>,</w:t>
+            </w:r>
+            <w:r>
+              <w:rPr>
+                <w:sz w:val="18"/>
+                <w:szCs w:val="18"/>
+              </w:rPr>
+              <w:t xml:space="preserve"> &lt;</w:t>
+            </w:r>
+            <w:r>
+              <w:rPr>
+                <w:sz w:val="18"/>
+                <w:szCs w:val="18"/>
+              </w:rPr>
+              <w:t>,</w:t>
+            </w:r>
+            <w:r>
+              <w:rPr>
+                <w:sz w:val="18"/>
+                <w:szCs w:val="18"/>
+              </w:rPr>
+              <w:t xml:space="preserve"> &gt;=</w:t>
+            </w:r>
+            <w:r>
+              <w:rPr>
+                <w:sz w:val="18"/>
+                <w:szCs w:val="18"/>
+              </w:rPr>
+              <w:t>,</w:t>
+            </w:r>
+            <w:r>
+              <w:rPr>
+                <w:sz w:val="18"/>
+                <w:szCs w:val="18"/>
+              </w:rPr>
+              <w:t xml:space="preserve"> &lt;=</w:t>
+            </w:r>
+            <w:r>
+              <w:rPr>
+                <w:sz w:val="18"/>
+                <w:szCs w:val="18"/>
+              </w:rPr>
+              <w:t>,</w:t>
+            </w:r>
+            <w:r>
+              <w:rPr>
+                <w:sz w:val="18"/>
+                <w:szCs w:val="18"/>
+              </w:rPr>
+              <w:t xml:space="preserve"> == </w:t>
+            </w:r>
+            <w:r>
+              <w:rPr>
+                <w:sz w:val="18"/>
+                <w:szCs w:val="18"/>
+              </w:rPr>
+              <w:t>,</w:t>
+            </w:r>
+            <w:r>
+              <w:rPr>
+                <w:sz w:val="18"/>
+                <w:szCs w:val="18"/>
+              </w:rPr>
+              <w:t>!=</w:t>
             </w:r>
           </w:p>
         </w:tc>
@@ -30516,7 +30648,28 @@
                 <w:sz w:val="18"/>
                 <w:szCs w:val="18"/>
               </w:rPr>
-              <w:t>`&amp;&amp;</w:t>
+              <w:t>`</w:t>
+            </w:r>
+            <w:r>
+              <w:rPr>
+                <w:sz w:val="18"/>
+                <w:szCs w:val="18"/>
+              </w:rPr>
+              <w:t>,</w:t>
+            </w:r>
+            <w:r>
+              <w:rPr>
+                <w:sz w:val="18"/>
+                <w:szCs w:val="18"/>
+              </w:rPr>
+              <w:t>&amp;&amp;</w:t>
+            </w:r>
+            <w:r>
+              <w:rPr>
+                <w:sz w:val="18"/>
+                <w:szCs w:val="18"/>
+              </w:rPr>
+              <w:t>,||</w:t>
             </w:r>
           </w:p>
         </w:tc>
@@ -30564,7 +30717,63 @@
                 <w:sz w:val="18"/>
                 <w:szCs w:val="18"/>
               </w:rPr>
-              <w:t>= += -= *= /=</w:t>
+              <w:t xml:space="preserve">= </w:t>
+            </w:r>
+            <w:r>
+              <w:rPr>
+                <w:sz w:val="18"/>
+                <w:szCs w:val="18"/>
+              </w:rPr>
+              <w:t>,</w:t>
+            </w:r>
+            <w:r>
+              <w:rPr>
+                <w:sz w:val="18"/>
+                <w:szCs w:val="18"/>
+              </w:rPr>
+              <w:t>+=</w:t>
+            </w:r>
+            <w:r>
+              <w:rPr>
+                <w:sz w:val="18"/>
+                <w:szCs w:val="18"/>
+              </w:rPr>
+              <w:t>,</w:t>
+            </w:r>
+            <w:r>
+              <w:rPr>
+                <w:sz w:val="18"/>
+                <w:szCs w:val="18"/>
+              </w:rPr>
+              <w:t xml:space="preserve"> -=</w:t>
+            </w:r>
+            <w:r>
+              <w:rPr>
+                <w:sz w:val="18"/>
+                <w:szCs w:val="18"/>
+              </w:rPr>
+              <w:t>,</w:t>
+            </w:r>
+            <w:r>
+              <w:rPr>
+                <w:sz w:val="18"/>
+                <w:szCs w:val="18"/>
+              </w:rPr>
+              <w:t xml:space="preserve"> *=</w:t>
+            </w:r>
+            <w:r>
+              <w:rPr>
+                <w:sz w:val="18"/>
+                <w:szCs w:val="18"/>
+              </w:rPr>
+              <w:t>,</w:t>
+            </w:r>
+            <w:r>
+              <w:rPr>
+                <w:sz w:val="18"/>
+                <w:szCs w:val="18"/>
+              </w:rPr>
+              <w:t xml:space="preserve"> /=</w:t>
             </w:r>
           </w:p>
         </w:tc>
@@ -30615,7 +30824,21 @@
                 <w:sz w:val="18"/>
                 <w:szCs w:val="18"/>
               </w:rPr>
-              <w:t>++ --</w:t>
+              <w:t>++</w:t>
+            </w:r>
+            <w:r>
+              <w:rPr>
+                <w:sz w:val="18"/>
+                <w:szCs w:val="18"/>
+              </w:rPr>
+              <w:t>,</w:t>
+            </w:r>
+            <w:r>
+              <w:rPr>
+                <w:sz w:val="18"/>
+                <w:szCs w:val="18"/>
+              </w:rPr>
+              <w:t xml:space="preserve"> --</w:t>
             </w:r>
           </w:p>
         </w:tc>
@@ -30663,7 +30886,28 @@
                 <w:sz w:val="18"/>
                 <w:szCs w:val="18"/>
               </w:rPr>
-              <w:t>`&amp;</w:t>
+              <w:t>`</w:t>
+            </w:r>
+            <w:r>
+              <w:rPr>
+                <w:sz w:val="18"/>
+                <w:szCs w:val="18"/>
+              </w:rPr>
+              <w:t>,</w:t>
+            </w:r>
+            <w:r>
+              <w:rPr>
+                <w:sz w:val="18"/>
+                <w:szCs w:val="18"/>
+              </w:rPr>
+              <w:t>&amp;</w:t>
+            </w:r>
+            <w:r>
+              <w:rPr>
+                <w:sz w:val="18"/>
+                <w:szCs w:val="18"/>
+              </w:rPr>
+              <w:t>,|</w:t>
             </w:r>
           </w:p>
         </w:tc>
@@ -30733,7 +30977,7 @@
           <w:szCs w:val="18"/>
         </w:rPr>
         <w:pict w14:anchorId="65A9F512">
-          <v:rect id="_x0000_i1115" style="width:0;height:1.5pt" o:hralign="center" o:hrstd="t" o:hr="t" fillcolor="#a0a0a0" stroked="f"/>
+          <v:rect id="_x0000_i1118" style="width:0;height:1.5pt" o:hralign="center" o:hrstd="t" o:hr="t" fillcolor="#a0a0a0" stroked="f"/>
         </w:pict>
       </w:r>
     </w:p>
@@ -31248,22 +31492,22 @@
           <w:sz w:val="18"/>
           <w:szCs w:val="18"/>
         </w:rPr>
+        <w:t>class ArithmeticExample {</w:t>
+      </w:r>
+    </w:p>
+    <w:p>
+      <w:pPr>
+        <w:rPr>
+          <w:sz w:val="18"/>
+          <w:szCs w:val="18"/>
+        </w:rPr>
+      </w:pPr>
+      <w:r>
+        <w:rPr>
+          <w:sz w:val="18"/>
+          <w:szCs w:val="18"/>
+        </w:rPr>
         <w:lastRenderedPageBreak/>
-        <w:t>class ArithmeticExample {</w:t>
-      </w:r>
-    </w:p>
-    <w:p>
-      <w:pPr>
-        <w:rPr>
-          <w:sz w:val="18"/>
-          <w:szCs w:val="18"/>
-        </w:rPr>
-      </w:pPr>
-      <w:r>
-        <w:rPr>
-          <w:sz w:val="18"/>
-          <w:szCs w:val="18"/>
-        </w:rPr>
         <w:t xml:space="preserve">    public static void main(String[] args) {</w:t>
       </w:r>
     </w:p>
@@ -31423,7 +31667,7 @@
           <w:szCs w:val="18"/>
         </w:rPr>
         <w:pict w14:anchorId="442B90AD">
-          <v:rect id="_x0000_i1116" style="width:0;height:1.5pt" o:hralign="center" o:hrstd="t" o:hr="t" fillcolor="#a0a0a0" stroked="f"/>
+          <v:rect id="_x0000_i1119" style="width:0;height:1.5pt" o:hralign="center" o:hrstd="t" o:hr="t" fillcolor="#a0a0a0" stroked="f"/>
         </w:pict>
       </w:r>
     </w:p>
@@ -31922,7 +32166,7 @@
           <w:szCs w:val="18"/>
         </w:rPr>
         <w:pict w14:anchorId="565A0E38">
-          <v:rect id="_x0000_i1117" style="width:0;height:1.5pt" o:hralign="center" o:hrstd="t" o:hr="t" fillcolor="#a0a0a0" stroked="f"/>
+          <v:rect id="_x0000_i1120" style="width:0;height:1.5pt" o:hralign="center" o:hrstd="t" o:hr="t" fillcolor="#a0a0a0" stroked="f"/>
         </w:pict>
       </w:r>
     </w:p>
@@ -31980,6 +32224,7 @@
       <w:tblPr>
         <w:tblStyle w:val="PlainTable1"/>
         <w:tblW w:w="0" w:type="auto"/>
+        <w:jc w:val="center"/>
         <w:tblLook w:val="04A0" w:firstRow="1" w:lastRow="0" w:firstColumn="1" w:lastColumn="0" w:noHBand="0" w:noVBand="1"/>
       </w:tblPr>
       <w:tblGrid>
@@ -31989,6 +32234,8 @@
       <w:tr>
         <w:trPr>
           <w:cnfStyle w:val="100000000000" w:firstRow="1" w:lastRow="0" w:firstColumn="0" w:lastColumn="0" w:oddVBand="0" w:evenVBand="0" w:oddHBand="0" w:evenHBand="0" w:firstRowFirstColumn="0" w:firstRowLastColumn="0" w:lastRowFirstColumn="0" w:lastRowLastColumn="0"/>
+          <w:trHeight w:val="397"/>
+          <w:jc w:val="center"/>
         </w:trPr>
         <w:tc>
           <w:tcPr>
@@ -32040,6 +32287,8 @@
       <w:tr>
         <w:trPr>
           <w:cnfStyle w:val="000000100000" w:firstRow="0" w:lastRow="0" w:firstColumn="0" w:lastColumn="0" w:oddVBand="0" w:evenVBand="0" w:oddHBand="1" w:evenHBand="0" w:firstRowFirstColumn="0" w:firstRowLastColumn="0" w:lastRowFirstColumn="0" w:lastRowLastColumn="0"/>
+          <w:trHeight w:val="397"/>
+          <w:jc w:val="center"/>
         </w:trPr>
         <w:tc>
           <w:tcPr>
@@ -32089,6 +32338,10 @@
         </w:tc>
       </w:tr>
       <w:tr>
+        <w:trPr>
+          <w:trHeight w:val="397"/>
+          <w:jc w:val="center"/>
+        </w:trPr>
         <w:tc>
           <w:tcPr>
             <w:cnfStyle w:val="001000000000" w:firstRow="0" w:lastRow="0" w:firstColumn="1" w:lastColumn="0" w:oddVBand="0" w:evenVBand="0" w:oddHBand="0" w:evenHBand="0" w:firstRowFirstColumn="0" w:firstRowLastColumn="0" w:lastRowFirstColumn="0" w:lastRowLastColumn="0"/>
@@ -32135,6 +32388,8 @@
       <w:tr>
         <w:trPr>
           <w:cnfStyle w:val="000000100000" w:firstRow="0" w:lastRow="0" w:firstColumn="0" w:lastColumn="0" w:oddVBand="0" w:evenVBand="0" w:oddHBand="1" w:evenHBand="0" w:firstRowFirstColumn="0" w:firstRowLastColumn="0" w:lastRowFirstColumn="0" w:lastRowLastColumn="0"/>
+          <w:trHeight w:val="397"/>
+          <w:jc w:val="center"/>
         </w:trPr>
         <w:tc>
           <w:tcPr>
@@ -32150,6 +32405,13 @@
                 <w:szCs w:val="18"/>
               </w:rPr>
             </w:pPr>
+            <w:r>
+              <w:rPr>
+                <w:sz w:val="18"/>
+                <w:szCs w:val="18"/>
+              </w:rPr>
+              <w:t>!</w:t>
+            </w:r>
           </w:p>
         </w:tc>
         <w:tc>
@@ -32161,47 +32423,6 @@
             <w:pPr>
               <w:spacing w:after="160" w:line="259" w:lineRule="auto"/>
               <w:cnfStyle w:val="000000100000" w:firstRow="0" w:lastRow="0" w:firstColumn="0" w:lastColumn="0" w:oddVBand="0" w:evenVBand="0" w:oddHBand="1" w:evenHBand="0" w:firstRowFirstColumn="0" w:firstRowLastColumn="0" w:lastRowFirstColumn="0" w:lastRowLastColumn="0"/>
-              <w:rPr>
-                <w:sz w:val="18"/>
-                <w:szCs w:val="18"/>
-              </w:rPr>
-            </w:pPr>
-          </w:p>
-        </w:tc>
-      </w:tr>
-      <w:tr>
-        <w:tc>
-          <w:tcPr>
-            <w:cnfStyle w:val="001000000000" w:firstRow="0" w:lastRow="0" w:firstColumn="1" w:lastColumn="0" w:oddVBand="0" w:evenVBand="0" w:oddHBand="0" w:evenHBand="0" w:firstRowFirstColumn="0" w:firstRowLastColumn="0" w:lastRowFirstColumn="0" w:lastRowLastColumn="0"/>
-            <w:tcW w:w="0" w:type="auto"/>
-            <w:hideMark/>
-          </w:tcPr>
-          <w:p>
-            <w:pPr>
-              <w:spacing w:after="160" w:line="259" w:lineRule="auto"/>
-              <w:rPr>
-                <w:sz w:val="18"/>
-                <w:szCs w:val="18"/>
-              </w:rPr>
-            </w:pPr>
-            <w:r>
-              <w:rPr>
-                <w:sz w:val="18"/>
-                <w:szCs w:val="18"/>
-              </w:rPr>
-              <w:t>!</w:t>
-            </w:r>
-          </w:p>
-        </w:tc>
-        <w:tc>
-          <w:tcPr>
-            <w:tcW w:w="0" w:type="auto"/>
-            <w:hideMark/>
-          </w:tcPr>
-          <w:p>
-            <w:pPr>
-              <w:spacing w:after="160" w:line="259" w:lineRule="auto"/>
-              <w:cnfStyle w:val="000000000000" w:firstRow="0" w:lastRow="0" w:firstColumn="0" w:lastColumn="0" w:oddVBand="0" w:evenVBand="0" w:oddHBand="0" w:evenHBand="0" w:firstRowFirstColumn="0" w:firstRowLastColumn="0" w:lastRowFirstColumn="0" w:lastRowLastColumn="0"/>
               <w:rPr>
                 <w:sz w:val="18"/>
                 <w:szCs w:val="18"/>
@@ -32245,22 +32466,22 @@
           <w:sz w:val="18"/>
           <w:szCs w:val="18"/>
         </w:rPr>
+        <w:t>boolean a = true;</w:t>
+      </w:r>
+    </w:p>
+    <w:p>
+      <w:pPr>
+        <w:rPr>
+          <w:sz w:val="18"/>
+          <w:szCs w:val="18"/>
+        </w:rPr>
+      </w:pPr>
+      <w:r>
+        <w:rPr>
+          <w:sz w:val="18"/>
+          <w:szCs w:val="18"/>
+        </w:rPr>
         <w:lastRenderedPageBreak/>
-        <w:t>boolean a = true;</w:t>
-      </w:r>
-    </w:p>
-    <w:p>
-      <w:pPr>
-        <w:rPr>
-          <w:sz w:val="18"/>
-          <w:szCs w:val="18"/>
-        </w:rPr>
-      </w:pPr>
-      <w:r>
-        <w:rPr>
-          <w:sz w:val="18"/>
-          <w:szCs w:val="18"/>
-        </w:rPr>
         <w:t>boolean b = false;</w:t>
       </w:r>
     </w:p>
@@ -32298,6 +32519,13 @@
           <w:sz w:val="18"/>
           <w:szCs w:val="18"/>
         </w:rPr>
+        <w:t xml:space="preserve">: </w:t>
+      </w:r>
+      <w:r>
+        <w:rPr>
+          <w:sz w:val="18"/>
+          <w:szCs w:val="18"/>
+        </w:rPr>
         <w:t xml:space="preserve"> </w:t>
       </w:r>
       <w:r>
@@ -32321,7 +32549,7 @@
           <w:szCs w:val="18"/>
         </w:rPr>
         <w:pict w14:anchorId="57E05E39">
-          <v:rect id="_x0000_i1118" style="width:0;height:1.5pt" o:hralign="center" o:hrstd="t" o:hr="t" fillcolor="#a0a0a0" stroked="f"/>
+          <v:rect id="_x0000_i1121" style="width:0;height:1.5pt" o:hralign="center" o:hrstd="t" o:hr="t" fillcolor="#a0a0a0" stroked="f"/>
         </w:pict>
       </w:r>
     </w:p>
@@ -32757,7 +32985,7 @@
           <w:szCs w:val="18"/>
         </w:rPr>
         <w:pict w14:anchorId="558B8F6A">
-          <v:rect id="_x0000_i1119" style="width:0;height:1.5pt" o:hralign="center" o:hrstd="t" o:hr="t" fillcolor="#a0a0a0" stroked="f"/>
+          <v:rect id="_x0000_i1122" style="width:0;height:1.5pt" o:hralign="center" o:hrstd="t" o:hr="t" fillcolor="#a0a0a0" stroked="f"/>
         </w:pict>
       </w:r>
     </w:p>
@@ -33058,7 +33286,7 @@
           <w:szCs w:val="18"/>
         </w:rPr>
         <w:pict w14:anchorId="6609C61F">
-          <v:rect id="_x0000_i1120" style="width:0;height:1.5pt" o:hralign="center" o:hrstd="t" o:hr="t" fillcolor="#a0a0a0" stroked="f"/>
+          <v:rect id="_x0000_i1123" style="width:0;height:1.5pt" o:hralign="center" o:hrstd="t" o:hr="t" fillcolor="#a0a0a0" stroked="f"/>
         </w:pict>
       </w:r>
     </w:p>
@@ -33399,22 +33627,22 @@
           <w:sz w:val="18"/>
           <w:szCs w:val="18"/>
         </w:rPr>
+        <w:t>int a = 5;</w:t>
+      </w:r>
+    </w:p>
+    <w:p>
+      <w:pPr>
+        <w:rPr>
+          <w:sz w:val="18"/>
+          <w:szCs w:val="18"/>
+        </w:rPr>
+      </w:pPr>
+      <w:r>
+        <w:rPr>
+          <w:sz w:val="18"/>
+          <w:szCs w:val="18"/>
+        </w:rPr>
         <w:lastRenderedPageBreak/>
-        <w:t>int a = 5;</w:t>
-      </w:r>
-    </w:p>
-    <w:p>
-      <w:pPr>
-        <w:rPr>
-          <w:sz w:val="18"/>
-          <w:szCs w:val="18"/>
-        </w:rPr>
-      </w:pPr>
-      <w:r>
-        <w:rPr>
-          <w:sz w:val="18"/>
-          <w:szCs w:val="18"/>
-        </w:rPr>
         <w:t>int b = 3;</w:t>
       </w:r>
     </w:p>
@@ -33446,7 +33674,7 @@
           <w:szCs w:val="18"/>
         </w:rPr>
         <w:pict w14:anchorId="200293B1">
-          <v:rect id="_x0000_i1121" style="width:0;height:1.5pt" o:hralign="center" o:hrstd="t" o:hr="t" fillcolor="#a0a0a0" stroked="f"/>
+          <v:rect id="_x0000_i1124" style="width:0;height:1.5pt" o:hralign="center" o:hrstd="t" o:hr="t" fillcolor="#a0a0a0" stroked="f"/>
         </w:pict>
       </w:r>
     </w:p>
@@ -33603,7 +33831,7 @@
           <w:szCs w:val="18"/>
         </w:rPr>
         <w:pict w14:anchorId="1DE8AD84">
-          <v:rect id="_x0000_i1122" style="width:0;height:1.5pt" o:hralign="center" o:hrstd="t" o:hr="t" fillcolor="#a0a0a0" stroked="f"/>
+          <v:rect id="_x0000_i1125" style="width:0;height:1.5pt" o:hralign="center" o:hrstd="t" o:hr="t" fillcolor="#a0a0a0" stroked="f"/>
         </w:pict>
       </w:r>
     </w:p>
@@ -33864,7 +34092,7 @@
           <w:szCs w:val="18"/>
         </w:rPr>
         <w:pict w14:anchorId="6B6B5D5B">
-          <v:rect id="_x0000_i1123" style="width:0;height:1.5pt" o:hralign="center" o:hrstd="t" o:hr="t" fillcolor="#a0a0a0" stroked="f"/>
+          <v:rect id="_x0000_i1126" style="width:0;height:1.5pt" o:hralign="center" o:hrstd="t" o:hr="t" fillcolor="#a0a0a0" stroked="f"/>
         </w:pict>
       </w:r>
     </w:p>
@@ -34013,7 +34241,7 @@
           <w:szCs w:val="18"/>
         </w:rPr>
         <w:pict w14:anchorId="10E95E8D">
-          <v:rect id="_x0000_i1124" style="width:0;height:1.5pt" o:hralign="center" o:hrstd="t" o:hr="t" fillcolor="#a0a0a0" stroked="f"/>
+          <v:rect id="_x0000_i1127" style="width:0;height:1.5pt" o:hralign="center" o:hrstd="t" o:hr="t" fillcolor="#a0a0a0" stroked="f"/>
         </w:pict>
       </w:r>
     </w:p>
@@ -34063,22 +34291,22 @@
           <w:sz w:val="18"/>
           <w:szCs w:val="18"/>
         </w:rPr>
+        <w:t>Evaluation:</w:t>
+      </w:r>
+    </w:p>
+    <w:p>
+      <w:pPr>
+        <w:rPr>
+          <w:sz w:val="18"/>
+          <w:szCs w:val="18"/>
+        </w:rPr>
+      </w:pPr>
+      <w:r>
+        <w:rPr>
+          <w:sz w:val="18"/>
+          <w:szCs w:val="18"/>
+        </w:rPr>
         <w:lastRenderedPageBreak/>
-        <w:t>Evaluation:</w:t>
-      </w:r>
-    </w:p>
-    <w:p>
-      <w:pPr>
-        <w:rPr>
-          <w:sz w:val="18"/>
-          <w:szCs w:val="18"/>
-        </w:rPr>
-      </w:pPr>
-      <w:r>
-        <w:rPr>
-          <w:sz w:val="18"/>
-          <w:szCs w:val="18"/>
-        </w:rPr>
         <w:t>10 + 5 = 15</w:t>
       </w:r>
       <w:r>
@@ -34148,7 +34376,7 @@
           <w:szCs w:val="18"/>
         </w:rPr>
         <w:pict w14:anchorId="63DD0FAD">
-          <v:rect id="_x0000_i1125" style="width:0;height:1.5pt" o:hralign="center" o:hrstd="t" o:hr="t" fillcolor="#a0a0a0" stroked="f"/>
+          <v:rect id="_x0000_i1128" style="width:0;height:1.5pt" o:hralign="center" o:hrstd="t" o:hr="t" fillcolor="#a0a0a0" stroked="f"/>
         </w:pict>
       </w:r>
     </w:p>
@@ -34180,7 +34408,7 @@
       <w:tblGrid>
         <w:gridCol w:w="779"/>
         <w:gridCol w:w="964"/>
-        <w:gridCol w:w="2077"/>
+        <w:gridCol w:w="2593"/>
       </w:tblGrid>
       <w:tr>
         <w:trPr>
@@ -34373,7 +34601,35 @@
                 <w:sz w:val="18"/>
                 <w:szCs w:val="18"/>
               </w:rPr>
-              <w:t>++ -- !</w:t>
+              <w:t>++</w:t>
+            </w:r>
+            <w:r>
+              <w:rPr>
+                <w:sz w:val="18"/>
+                <w:szCs w:val="18"/>
+              </w:rPr>
+              <w:t>,</w:t>
+            </w:r>
+            <w:r>
+              <w:rPr>
+                <w:sz w:val="18"/>
+                <w:szCs w:val="18"/>
+              </w:rPr>
+              <w:t xml:space="preserve"> --</w:t>
+            </w:r>
+            <w:r>
+              <w:rPr>
+                <w:sz w:val="18"/>
+                <w:szCs w:val="18"/>
+              </w:rPr>
+              <w:t>,</w:t>
+            </w:r>
+            <w:r>
+              <w:rPr>
+                <w:sz w:val="18"/>
+                <w:szCs w:val="18"/>
+              </w:rPr>
+              <w:t xml:space="preserve"> !</w:t>
             </w:r>
           </w:p>
         </w:tc>
@@ -34447,7 +34703,35 @@
                 <w:sz w:val="18"/>
                 <w:szCs w:val="18"/>
               </w:rPr>
-              <w:t>* / %</w:t>
+              <w:t xml:space="preserve">* </w:t>
+            </w:r>
+            <w:r>
+              <w:rPr>
+                <w:sz w:val="18"/>
+                <w:szCs w:val="18"/>
+              </w:rPr>
+              <w:t>,</w:t>
+            </w:r>
+            <w:r>
+              <w:rPr>
+                <w:sz w:val="18"/>
+                <w:szCs w:val="18"/>
+              </w:rPr>
+              <w:t>/</w:t>
+            </w:r>
+            <w:r>
+              <w:rPr>
+                <w:sz w:val="18"/>
+                <w:szCs w:val="18"/>
+              </w:rPr>
+              <w:t>,</w:t>
+            </w:r>
+            <w:r>
+              <w:rPr>
+                <w:sz w:val="18"/>
+                <w:szCs w:val="18"/>
+              </w:rPr>
+              <w:t xml:space="preserve"> %</w:t>
             </w:r>
           </w:p>
         </w:tc>
@@ -34471,6 +34755,13 @@
                 <w:szCs w:val="18"/>
               </w:rPr>
               <w:t>Multiplication, division</w:t>
+            </w:r>
+            <w:r>
+              <w:rPr>
+                <w:sz w:val="18"/>
+                <w:szCs w:val="18"/>
+              </w:rPr>
+              <w:t>, modelus</w:t>
             </w:r>
           </w:p>
         </w:tc>
@@ -34518,7 +34809,21 @@
                 <w:sz w:val="18"/>
                 <w:szCs w:val="18"/>
               </w:rPr>
-              <w:t>+ -</w:t>
+              <w:t>+</w:t>
+            </w:r>
+            <w:r>
+              <w:rPr>
+                <w:sz w:val="18"/>
+                <w:szCs w:val="18"/>
+              </w:rPr>
+              <w:t>,</w:t>
+            </w:r>
+            <w:r>
+              <w:rPr>
+                <w:sz w:val="18"/>
+                <w:szCs w:val="18"/>
+              </w:rPr>
+              <w:t xml:space="preserve"> -</w:t>
             </w:r>
           </w:p>
         </w:tc>
@@ -34826,6 +35131,13 @@
                 <w:szCs w:val="18"/>
               </w:rPr>
             </w:pPr>
+            <w:r>
+              <w:rPr>
+                <w:sz w:val="18"/>
+                <w:szCs w:val="18"/>
+              </w:rPr>
+              <w:t>Logical not</w:t>
+            </w:r>
           </w:p>
         </w:tc>
       </w:tr>
@@ -34946,7 +35258,35 @@
                 <w:sz w:val="18"/>
                 <w:szCs w:val="18"/>
               </w:rPr>
-              <w:t>= += -=</w:t>
+              <w:t xml:space="preserve">= </w:t>
+            </w:r>
+            <w:r>
+              <w:rPr>
+                <w:sz w:val="18"/>
+                <w:szCs w:val="18"/>
+              </w:rPr>
+              <w:t>,</w:t>
+            </w:r>
+            <w:r>
+              <w:rPr>
+                <w:sz w:val="18"/>
+                <w:szCs w:val="18"/>
+              </w:rPr>
+              <w:t>+=</w:t>
+            </w:r>
+            <w:r>
+              <w:rPr>
+                <w:sz w:val="18"/>
+                <w:szCs w:val="18"/>
+              </w:rPr>
+              <w:t>,</w:t>
+            </w:r>
+            <w:r>
+              <w:rPr>
+                <w:sz w:val="18"/>
+                <w:szCs w:val="18"/>
+              </w:rPr>
+              <w:t xml:space="preserve"> -=</w:t>
             </w:r>
           </w:p>
         </w:tc>
@@ -34988,7 +35328,7 @@
           <w:szCs w:val="18"/>
         </w:rPr>
         <w:pict w14:anchorId="32AF527D">
-          <v:rect id="_x0000_i1126" style="width:0;height:1.5pt" o:hralign="center" o:hrstd="t" o:hr="t" fillcolor="#a0a0a0" stroked="f"/>
+          <v:rect id="_x0000_i1129" style="width:0;height:1.5pt" o:hralign="center" o:hrstd="t" o:hr="t" fillcolor="#a0a0a0" stroked="f"/>
         </w:pict>
       </w:r>
     </w:p>
@@ -35147,7 +35487,7 @@
           <w:szCs w:val="18"/>
         </w:rPr>
         <w:pict w14:anchorId="0AFC5BCE">
-          <v:rect id="_x0000_i1127" style="width:0;height:1.5pt" o:hralign="center" o:hrstd="t" o:hr="t" fillcolor="#a0a0a0" stroked="f"/>
+          <v:rect id="_x0000_i1130" style="width:0;height:1.5pt" o:hralign="center" o:hrstd="t" o:hr="t" fillcolor="#a0a0a0" stroked="f"/>
         </w:pict>
       </w:r>
     </w:p>
@@ -35220,7 +35560,7 @@
           <w:szCs w:val="18"/>
         </w:rPr>
         <w:pict w14:anchorId="0E5AB1E0">
-          <v:rect id="_x0000_i1128" style="width:0;height:1.5pt" o:hralign="center" o:hrstd="t" o:hr="t" fillcolor="#a0a0a0" stroked="f"/>
+          <v:rect id="_x0000_i1131" style="width:0;height:1.5pt" o:hralign="center" o:hrstd="t" o:hr="t" fillcolor="#a0a0a0" stroked="f"/>
         </w:pict>
       </w:r>
     </w:p>
@@ -35276,7 +35616,6 @@
                 <w:sz w:val="18"/>
                 <w:szCs w:val="18"/>
               </w:rPr>
-              <w:lastRenderedPageBreak/>
               <w:t>Type</w:t>
             </w:r>
           </w:p>
@@ -35328,6 +35667,7 @@
                 <w:sz w:val="18"/>
                 <w:szCs w:val="18"/>
               </w:rPr>
+              <w:lastRenderedPageBreak/>
               <w:t>Left to Right</w:t>
             </w:r>
           </w:p>
@@ -35418,7 +35758,7 @@
           <w:szCs w:val="18"/>
         </w:rPr>
         <w:pict w14:anchorId="48668F27">
-          <v:rect id="_x0000_i1129" style="width:0;height:1.5pt" o:hralign="center" o:hrstd="t" o:hr="t" fillcolor="#a0a0a0" stroked="f"/>
+          <v:rect id="_x0000_i1132" style="width:0;height:1.5pt" o:hralign="center" o:hrstd="t" o:hr="t" fillcolor="#a0a0a0" stroked="f"/>
         </w:pict>
       </w:r>
     </w:p>
@@ -35536,7 +35876,7 @@
           <w:szCs w:val="18"/>
         </w:rPr>
         <w:pict w14:anchorId="218EAE86">
-          <v:rect id="_x0000_i1130" style="width:0;height:1.5pt" o:hralign="center" o:hrstd="t" o:hr="t" fillcolor="#a0a0a0" stroked="f"/>
+          <v:rect id="_x0000_i1133" style="width:0;height:1.5pt" o:hralign="center" o:hrstd="t" o:hr="t" fillcolor="#a0a0a0" stroked="f"/>
         </w:pict>
       </w:r>
     </w:p>
@@ -35671,7 +36011,7 @@
           <w:szCs w:val="18"/>
         </w:rPr>
         <w:pict w14:anchorId="79CA1EF9">
-          <v:rect id="_x0000_i1131" style="width:0;height:1.5pt" o:hralign="center" o:hrstd="t" o:hr="t" fillcolor="#a0a0a0" stroked="f"/>
+          <v:rect id="_x0000_i1134" style="width:0;height:1.5pt" o:hralign="center" o:hrstd="t" o:hr="t" fillcolor="#a0a0a0" stroked="f"/>
         </w:pict>
       </w:r>
     </w:p>
@@ -35860,7 +36200,7 @@
           <w:szCs w:val="18"/>
         </w:rPr>
         <w:pict w14:anchorId="5A131D8F">
-          <v:rect id="_x0000_i1132" style="width:0;height:1.5pt" o:hralign="center" o:hrstd="t" o:hr="t" fillcolor="#a0a0a0" stroked="f"/>
+          <v:rect id="_x0000_i1135" style="width:0;height:1.5pt" o:hralign="center" o:hrstd="t" o:hr="t" fillcolor="#a0a0a0" stroked="f"/>
         </w:pict>
       </w:r>
     </w:p>
@@ -36015,7 +36355,6 @@
                 <w:sz w:val="18"/>
                 <w:szCs w:val="18"/>
               </w:rPr>
-              <w:lastRenderedPageBreak/>
               <w:t>Associativity</w:t>
             </w:r>
           </w:p>
@@ -36058,7 +36397,7 @@
           <w:szCs w:val="18"/>
         </w:rPr>
         <w:pict w14:anchorId="2A61CE64">
-          <v:rect id="_x0000_i1133" style="width:0;height:1.5pt" o:hralign="center" o:hrstd="t" o:hr="t" fillcolor="#a0a0a0" stroked="f"/>
+          <v:rect id="_x0000_i1136" style="width:0;height:1.5pt" o:hralign="center" o:hrstd="t" o:hr="t" fillcolor="#a0a0a0" stroked="f"/>
         </w:pict>
       </w:r>
     </w:p>
@@ -36078,6 +36417,7 @@
           <w:sz w:val="18"/>
           <w:szCs w:val="18"/>
         </w:rPr>
+        <w:lastRenderedPageBreak/>
         <w:t>3. Type Conversion</w:t>
       </w:r>
     </w:p>
@@ -36169,7 +36509,7 @@
           <w:szCs w:val="18"/>
         </w:rPr>
         <w:pict w14:anchorId="0537AB32">
-          <v:rect id="_x0000_i1134" style="width:0;height:1.5pt" o:hralign="center" o:hrstd="t" o:hr="t" fillcolor="#a0a0a0" stroked="f"/>
+          <v:rect id="_x0000_i1137" style="width:0;height:1.5pt" o:hralign="center" o:hrstd="t" o:hr="t" fillcolor="#a0a0a0" stroked="f"/>
         </w:pict>
       </w:r>
     </w:p>
@@ -36366,7 +36706,7 @@
           <w:szCs w:val="18"/>
         </w:rPr>
         <w:pict w14:anchorId="43AF60F9">
-          <v:rect id="_x0000_i1135" style="width:0;height:1.5pt" o:hralign="center" o:hrstd="t" o:hr="t" fillcolor="#a0a0a0" stroked="f"/>
+          <v:rect id="_x0000_i1138" style="width:0;height:1.5pt" o:hralign="center" o:hrstd="t" o:hr="t" fillcolor="#a0a0a0" stroked="f"/>
         </w:pict>
       </w:r>
     </w:p>
@@ -36473,7 +36813,7 @@
           <w:szCs w:val="18"/>
         </w:rPr>
         <w:pict w14:anchorId="3A28190F">
-          <v:rect id="_x0000_i1136" style="width:0;height:1.5pt" o:hralign="center" o:hrstd="t" o:hr="t" fillcolor="#a0a0a0" stroked="f"/>
+          <v:rect id="_x0000_i1139" style="width:0;height:1.5pt" o:hralign="center" o:hrstd="t" o:hr="t" fillcolor="#a0a0a0" stroked="f"/>
         </w:pict>
       </w:r>
     </w:p>
@@ -36608,7 +36948,7 @@
           <w:szCs w:val="18"/>
         </w:rPr>
         <w:pict w14:anchorId="2F561DCE">
-          <v:rect id="_x0000_i1137" style="width:0;height:1.5pt" o:hralign="center" o:hrstd="t" o:hr="t" fillcolor="#a0a0a0" stroked="f"/>
+          <v:rect id="_x0000_i1140" style="width:0;height:1.5pt" o:hralign="center" o:hrstd="t" o:hr="t" fillcolor="#a0a0a0" stroked="f"/>
         </w:pict>
       </w:r>
     </w:p>
@@ -36759,6 +37099,61 @@
     <w:p>
       <w:pPr>
         <w:rPr>
+          <w:rFonts w:cstheme="minorHAnsi"/>
+          <w:sz w:val="18"/>
+          <w:szCs w:val="18"/>
+        </w:rPr>
+      </w:pPr>
+      <w:r>
+        <w:rPr>
+          <w:rFonts w:cstheme="minorHAnsi"/>
+          <w:sz w:val="18"/>
+          <w:szCs w:val="18"/>
+        </w:rPr>
+        <w:t>└───────────────────┘        └──────────┘</w:t>
+      </w:r>
+    </w:p>
+    <w:p>
+      <w:pPr>
+        <w:rPr>
+          <w:sz w:val="18"/>
+          <w:szCs w:val="18"/>
+        </w:rPr>
+      </w:pPr>
+      <w:r>
+        <w:rPr>
+          <w:sz w:val="18"/>
+          <w:szCs w:val="18"/>
+        </w:rPr>
+        <w:t xml:space="preserve">     </w:t>
+      </w:r>
+      <w:r>
+        <w:rPr>
+          <w:sz w:val="18"/>
+          <w:szCs w:val="18"/>
+        </w:rPr>
+        <w:tab/>
+        <w:t>Intger</w:t>
+      </w:r>
+      <w:r>
+        <w:rPr>
+          <w:sz w:val="18"/>
+          <w:szCs w:val="18"/>
+        </w:rPr>
+        <w:tab/>
+      </w:r>
+      <w:r>
+        <w:rPr>
+          <w:sz w:val="18"/>
+          <w:szCs w:val="18"/>
+        </w:rPr>
+        <w:tab/>
+        <w:t xml:space="preserve">        float</w:t>
+      </w:r>
+    </w:p>
+    <w:p>
+      <w:pPr>
+        <w:rPr>
           <w:sz w:val="18"/>
           <w:szCs w:val="18"/>
         </w:rPr>
@@ -36791,7 +37186,7 @@
           <w:szCs w:val="18"/>
         </w:rPr>
         <w:pict w14:anchorId="15C23B02">
-          <v:rect id="_x0000_i1138" style="width:0;height:1.5pt" o:hralign="center" o:hrstd="t" o:hr="t" fillcolor="#a0a0a0" stroked="f"/>
+          <v:rect id="_x0000_i1141" style="width:0;height:1.5pt" o:hralign="center" o:hrstd="t" o:hr="t" fillcolor="#a0a0a0" stroked="f"/>
         </w:pict>
       </w:r>
     </w:p>
@@ -36887,7 +37282,7 @@
           <w:szCs w:val="18"/>
         </w:rPr>
         <w:pict w14:anchorId="575E8707">
-          <v:rect id="_x0000_i1139" style="width:0;height:1.5pt" o:hralign="center" o:hrstd="t" o:hr="t" fillcolor="#a0a0a0" stroked="f"/>
+          <v:rect id="_x0000_i1142" style="width:0;height:1.5pt" o:hralign="center" o:hrstd="t" o:hr="t" fillcolor="#a0a0a0" stroked="f"/>
         </w:pict>
       </w:r>
     </w:p>
@@ -37037,7 +37432,7 @@
           <w:szCs w:val="18"/>
         </w:rPr>
         <w:pict w14:anchorId="606F066F">
-          <v:rect id="_x0000_i1140" style="width:0;height:1.5pt" o:hralign="center" o:hrstd="t" o:hr="t" fillcolor="#a0a0a0" stroked="f"/>
+          <v:rect id="_x0000_i1143" style="width:0;height:1.5pt" o:hralign="center" o:hrstd="t" o:hr="t" fillcolor="#a0a0a0" stroked="f"/>
         </w:pict>
       </w:r>
     </w:p>
@@ -37086,7 +37481,21 @@
           <w:sz w:val="18"/>
           <w:szCs w:val="18"/>
         </w:rPr>
-        <w:t>datatype variable = (datatype) value;</w:t>
+        <w:t>datatype variable = (datatype) value</w:t>
+      </w:r>
+      <w:r>
+        <w:rPr>
+          <w:sz w:val="18"/>
+          <w:szCs w:val="18"/>
+        </w:rPr>
+        <w:t xml:space="preserve"> or variable</w:t>
+      </w:r>
+      <w:r>
+        <w:rPr>
+          <w:sz w:val="18"/>
+          <w:szCs w:val="18"/>
+        </w:rPr>
+        <w:t>;</w:t>
       </w:r>
     </w:p>
     <w:p>
@@ -37161,7 +37570,7 @@
           <w:szCs w:val="18"/>
         </w:rPr>
         <w:pict w14:anchorId="1E56C9EF">
-          <v:rect id="_x0000_i1141" style="width:0;height:1.5pt" o:hralign="center" o:hrstd="t" o:hr="t" fillcolor="#a0a0a0" stroked="f"/>
+          <v:rect id="_x0000_i1144" style="width:0;height:1.5pt" o:hralign="center" o:hrstd="t" o:hr="t" fillcolor="#a0a0a0" stroked="f"/>
         </w:pict>
       </w:r>
     </w:p>
@@ -37328,7 +37737,7 @@
           <w:szCs w:val="18"/>
         </w:rPr>
         <w:pict w14:anchorId="028DA819">
-          <v:rect id="_x0000_i1142" style="width:0;height:1.5pt" o:hralign="center" o:hrstd="t" o:hr="t" fillcolor="#a0a0a0" stroked="f"/>
+          <v:rect id="_x0000_i1145" style="width:0;height:1.5pt" o:hralign="center" o:hrstd="t" o:hr="t" fillcolor="#a0a0a0" stroked="f"/>
         </w:pict>
       </w:r>
     </w:p>
@@ -37664,6 +38073,14 @@
         </w:rPr>
       </w:pPr>
     </w:p>
+    <w:p>
+      <w:pPr>
+        <w:rPr>
+          <w:sz w:val="18"/>
+          <w:szCs w:val="18"/>
+        </w:rPr>
+      </w:pPr>
+    </w:p>
     <w:sectPr>
       <w:pgSz w:w="11906" w:h="16838"/>
       <w:pgMar w:top="1440" w:right="1440" w:bottom="1440" w:left="1440" w:header="708" w:footer="708" w:gutter="0"/>
@@ -37678,7 +38095,7 @@
 <w:numbering xmlns:wpc="http://schemas.microsoft.com/office/word/2010/wordprocessingCanvas" xmlns:cx="http://schemas.microsoft.com/office/drawing/2014/chartex" xmlns:cx1="http://schemas.microsoft.com/office/drawing/2015/9/8/chartex" xmlns:cx2="http://schemas.microsoft.com/office/drawing/2015/10/21/chartex" xmlns:cx3="http://schemas.microsoft.com/office/drawing/2016/5/9/chartex" xmlns:cx4="http://schemas.microsoft.com/office/drawing/2016/5/10/chartex" xmlns:cx5="http://schemas.microsoft.com/office/drawing/2016/5/11/chartex" xmlns:cx6="http://schemas.microsoft.com/office/drawing/2016/5/12/chartex" xmlns:cx7="http://schemas.microsoft.com/office/drawing/2016/5/13/chartex" xmlns:cx8="http://schemas.microsoft.com/office/drawing/2016/5/14/chartex" xmlns:mc="http://schemas.openxmlformats.org/markup-compatibility/2006" xmlns:aink="http://schemas.microsoft.com/office/drawing/2016/ink" xmlns:am3d="http://schemas.microsoft.com/office/drawing/2017/model3d" xmlns:o="urn:schemas-microsoft-com:office:office" xmlns:oel="http://schemas.microsoft.com/office/2019/extlst" xmlns:r="http://schemas.openxmlformats.org/officeDocument/2006/relationships" xmlns:m="http://schemas.openxmlformats.org/officeDocument/2006/math" xmlns:v="urn:schemas-microsoft-com:vml" xmlns:wp14="http://schemas.microsoft.com/office/word/2010/wordprocessingDrawing" xmlns:wp="http://schemas.openxmlformats.org/drawingml/2006/wordprocessingDrawing" xmlns:w10="urn:schemas-microsoft-com:office:word" xmlns:w="http://schemas.openxmlformats.org/wordprocessingml/2006/main" xmlns:w14="http://schemas.microsoft.com/office/word/2010/wordml" xmlns:w15="http://schemas.microsoft.com/office/word/2012/wordml" xmlns:w16cex="http://schemas.microsoft.com/office/word/2018/wordml/cex" xmlns:w16cid="http://schemas.microsoft.com/office/word/2016/wordml/cid" xmlns:w16="http://schemas.microsoft.com/office/word/2018/wordml" xmlns:w16du="http://schemas.microsoft.com/office/word/2023/wordml/word16du" xmlns:w16sdtdh="http://schemas.microsoft.com/office/word/2020/wordml/sdtdatahash" xmlns:w16sdtfl="http://schemas.microsoft.com/office/word/2024/wordml/sdtformatlock" xmlns:w16se="http://schemas.microsoft.com/office/word/2015/wordml/symex" xmlns:wpg="http://schemas.microsoft.com/office/word/2010/wordprocessingGroup" xmlns:wpi="http://schemas.microsoft.com/office/word/2010/wordprocessingInk" xmlns:wne="http://schemas.microsoft.com/office/word/2006/wordml" xmlns:wps="http://schemas.microsoft.com/office/word/2010/wordprocessingShape" mc:Ignorable="w14 w15 w16se w16cid w16 w16cex w16sdtdh w16sdtfl w16du wp14">
   <w:numPicBullet w:numPicBulletId="0">
     <w:pict>
-      <v:rect id="_x0000_i1040" style="width:0;height:1.5pt" o:hralign="center" o:bullet="t" o:hrstd="t" o:hr="t" fillcolor="#a0a0a0" stroked="f"/>
+      <v:rect id="_x0000_i1031" style="width:0;height:1.5pt" o:hralign="center" o:bullet="t" o:hrstd="t" o:hr="t" fillcolor="#a0a0a0" stroked="f"/>
     </w:pict>
   </w:numPicBullet>
   <w:abstractNum w:abstractNumId="0" w15:restartNumberingAfterBreak="0">
@@ -45455,6 +45872,7 @@
   <w:style w:type="character" w:default="1" w:styleId="DefaultParagraphFont">
     <w:name w:val="Default Paragraph Font"/>
     <w:uiPriority w:val="1"/>
+    <w:semiHidden/>
     <w:unhideWhenUsed/>
   </w:style>
   <w:style w:type="table" w:default="1" w:styleId="TableNormal">
@@ -45871,6 +46289,25 @@
       </w:tcPr>
     </w:tblStylePr>
   </w:style>
+  <w:style w:type="table" w:styleId="TableGrid">
+    <w:name w:val="Table Grid"/>
+    <w:basedOn w:val="TableNormal"/>
+    <w:uiPriority w:val="39"/>
+    <w:rsid w:val="005513D1"/>
+    <w:pPr>
+      <w:spacing w:after="0" w:line="240" w:lineRule="auto"/>
+    </w:pPr>
+    <w:tblPr>
+      <w:tblBorders>
+        <w:top w:val="single" w:sz="4" w:space="0" w:color="auto"/>
+        <w:left w:val="single" w:sz="4" w:space="0" w:color="auto"/>
+        <w:bottom w:val="single" w:sz="4" w:space="0" w:color="auto"/>
+        <w:right w:val="single" w:sz="4" w:space="0" w:color="auto"/>
+        <w:insideH w:val="single" w:sz="4" w:space="0" w:color="auto"/>
+        <w:insideV w:val="single" w:sz="4" w:space="0" w:color="auto"/>
+      </w:tblBorders>
+    </w:tblPr>
+  </w:style>
 </w:styles>
 </file>
 

</xml_diff>